<commit_message>
Commit: Implement additional functionality for multiple seats booking and improve seat layout display. 1. Add “Book multiple seats” feature to allow group reservations in a single operation. 2. Update menu structure to include the new option. 3. Refactor booking logic to reuse existing seat validation and booking functions. 4. Improve seat layout display with column labels (A–F) and a clearer aisle separator.
</commit_message>
<xml_diff>
--- a/FC723 Project – Documentation/Documentation.docx
+++ b/FC723 Project – Documentation/Documentation.docx
@@ -1573,45 +1573,422 @@
           <w:lang w:val="en-US" w:eastAsia="zh-CN"/>
         </w:rPr>
       </w:pPr>
-    </w:p>
-    <w:p>
-      <w:pPr>
-        <w:jc w:val="left"/>
-        <w:rPr>
-          <w:rFonts w:hint="default" w:ascii="Arial" w:hAnsi="Arial" w:cs="Arial"/>
-          <w:b w:val="0"/>
-          <w:bCs w:val="0"/>
-          <w:sz w:val="24"/>
-          <w:szCs w:val="24"/>
-          <w:lang w:val="en-US" w:eastAsia="zh-CN"/>
-        </w:rPr>
-      </w:pPr>
-      <w:r>
-        <w:rPr>
-          <w:rFonts w:hint="default" w:ascii="Arial" w:hAnsi="Arial" w:cs="Arial"/>
-          <w:b w:val="0"/>
-          <w:bCs w:val="0"/>
-          <w:sz w:val="24"/>
-          <w:szCs w:val="24"/>
-          <w:lang w:val="en-US" w:eastAsia="zh-CN"/>
-        </w:rPr>
-        <w:t>A.5 Additional functionality implementation</w:t>
-      </w:r>
-    </w:p>
-    <w:p>
-      <w:pPr>
-        <w:jc w:val="left"/>
-        <w:rPr>
-          <w:rFonts w:hint="default" w:ascii="Arial" w:hAnsi="Arial" w:cs="Arial"/>
-          <w:b w:val="0"/>
-          <w:bCs w:val="0"/>
-          <w:sz w:val="24"/>
-          <w:szCs w:val="24"/>
-          <w:lang w:val="en-US" w:eastAsia="zh-CN"/>
-        </w:rPr>
-      </w:pPr>
       <w:bookmarkStart w:id="0" w:name="_GoBack"/>
       <w:bookmarkEnd w:id="0"/>
+    </w:p>
+    <w:p>
+      <w:pPr>
+        <w:jc w:val="left"/>
+        <w:rPr>
+          <w:rFonts w:hint="default" w:ascii="Arial" w:hAnsi="Arial" w:cs="Arial"/>
+          <w:b w:val="0"/>
+          <w:bCs w:val="0"/>
+          <w:sz w:val="24"/>
+          <w:szCs w:val="24"/>
+          <w:lang w:val="en-US" w:eastAsia="zh-CN"/>
+        </w:rPr>
+      </w:pPr>
+      <w:r>
+        <w:rPr>
+          <w:rFonts w:hint="default" w:ascii="Arial" w:hAnsi="Arial" w:cs="Arial"/>
+          <w:b w:val="0"/>
+          <w:bCs w:val="0"/>
+          <w:sz w:val="24"/>
+          <w:szCs w:val="24"/>
+          <w:lang w:val="en-US" w:eastAsia="zh-CN"/>
+        </w:rPr>
+        <w:t>A.5 Additional functionality implementation</w:t>
+      </w:r>
+    </w:p>
+    <w:p>
+      <w:pPr>
+        <w:jc w:val="left"/>
+        <w:rPr>
+          <w:rFonts w:hint="default" w:ascii="Arial" w:hAnsi="Arial" w:cs="Arial"/>
+          <w:b w:val="0"/>
+          <w:bCs w:val="0"/>
+          <w:sz w:val="24"/>
+          <w:szCs w:val="24"/>
+          <w:lang w:val="en-US" w:eastAsia="zh-CN"/>
+        </w:rPr>
+      </w:pPr>
+      <w:r>
+        <w:rPr>
+          <w:rFonts w:hint="default" w:ascii="Arial" w:hAnsi="Arial" w:cs="Arial"/>
+          <w:b w:val="0"/>
+          <w:bCs w:val="0"/>
+          <w:sz w:val="24"/>
+          <w:szCs w:val="24"/>
+          <w:lang w:val="en-US" w:eastAsia="zh-CN"/>
+        </w:rPr>
+        <w:t>In addition to the required functionalities, an extra feature called “” was implemented.</w:t>
+      </w:r>
+    </w:p>
+    <w:p>
+      <w:pPr>
+        <w:jc w:val="left"/>
+        <w:rPr>
+          <w:rFonts w:hint="default" w:ascii="Arial" w:hAnsi="Arial" w:cs="Arial"/>
+          <w:b w:val="0"/>
+          <w:bCs w:val="0"/>
+          <w:sz w:val="24"/>
+          <w:szCs w:val="24"/>
+          <w:lang w:val="en-US" w:eastAsia="zh-CN"/>
+        </w:rPr>
+      </w:pPr>
+    </w:p>
+    <w:p>
+      <w:pPr>
+        <w:jc w:val="left"/>
+        <w:rPr>
+          <w:rFonts w:hint="default" w:ascii="Arial" w:hAnsi="Arial" w:cs="Arial"/>
+          <w:b w:val="0"/>
+          <w:bCs w:val="0"/>
+          <w:sz w:val="24"/>
+          <w:szCs w:val="24"/>
+          <w:lang w:val="en-US" w:eastAsia="zh-CN"/>
+        </w:rPr>
+      </w:pPr>
+      <w:r>
+        <w:rPr>
+          <w:rFonts w:hint="default" w:ascii="Arial" w:hAnsi="Arial" w:cs="Arial"/>
+          <w:b w:val="0"/>
+          <w:bCs w:val="0"/>
+          <w:sz w:val="24"/>
+          <w:szCs w:val="24"/>
+          <w:lang w:val="en-US" w:eastAsia="zh-CN"/>
+        </w:rPr>
+        <w:t>This functionality allows a user to reserve more than one seat in a single operation. This is a common feature in airline booking systems because passengers often travel with friends, family members, or in small groups.</w:t>
+      </w:r>
+    </w:p>
+    <w:p>
+      <w:pPr>
+        <w:jc w:val="left"/>
+        <w:rPr>
+          <w:rFonts w:hint="default" w:ascii="Arial" w:hAnsi="Arial" w:cs="Arial"/>
+          <w:b w:val="0"/>
+          <w:bCs w:val="0"/>
+          <w:sz w:val="24"/>
+          <w:szCs w:val="24"/>
+          <w:lang w:val="en-US" w:eastAsia="zh-CN"/>
+        </w:rPr>
+      </w:pPr>
+    </w:p>
+    <w:p>
+      <w:pPr>
+        <w:jc w:val="left"/>
+        <w:rPr>
+          <w:rFonts w:hint="default" w:ascii="Arial" w:hAnsi="Arial" w:cs="Arial"/>
+          <w:b w:val="0"/>
+          <w:bCs w:val="0"/>
+          <w:sz w:val="24"/>
+          <w:szCs w:val="24"/>
+          <w:lang w:val="en-US" w:eastAsia="zh-CN"/>
+        </w:rPr>
+      </w:pPr>
+      <w:r>
+        <w:rPr>
+          <w:rFonts w:hint="default" w:ascii="Arial" w:hAnsi="Arial" w:cs="Arial"/>
+          <w:b w:val="0"/>
+          <w:bCs w:val="0"/>
+          <w:sz w:val="24"/>
+          <w:szCs w:val="24"/>
+          <w:lang w:val="en-US" w:eastAsia="zh-CN"/>
+        </w:rPr>
+        <w:t>The purpose of this feature is to improve convenience and reduce repetition. Without this function, a user would need to repeat the booking process several times when reserving seats for a group. By allowing multiple seat selections in one process, the system becomes more efficient and user-friendly.</w:t>
+      </w:r>
+    </w:p>
+    <w:p>
+      <w:pPr>
+        <w:jc w:val="left"/>
+        <w:rPr>
+          <w:rFonts w:hint="default" w:ascii="Arial" w:hAnsi="Arial" w:cs="Arial"/>
+          <w:b w:val="0"/>
+          <w:bCs w:val="0"/>
+          <w:sz w:val="24"/>
+          <w:szCs w:val="24"/>
+          <w:lang w:val="en-US" w:eastAsia="zh-CN"/>
+        </w:rPr>
+      </w:pPr>
+    </w:p>
+    <w:p>
+      <w:pPr>
+        <w:jc w:val="left"/>
+        <w:rPr>
+          <w:rFonts w:hint="default" w:ascii="Arial" w:hAnsi="Arial" w:cs="Arial"/>
+          <w:b w:val="0"/>
+          <w:bCs w:val="0"/>
+          <w:sz w:val="24"/>
+          <w:szCs w:val="24"/>
+          <w:lang w:val="en-US" w:eastAsia="zh-CN"/>
+        </w:rPr>
+      </w:pPr>
+      <w:r>
+        <w:rPr>
+          <w:rFonts w:hint="default" w:ascii="Arial" w:hAnsi="Arial" w:cs="Arial"/>
+          <w:b w:val="0"/>
+          <w:bCs w:val="0"/>
+          <w:sz w:val="24"/>
+          <w:szCs w:val="24"/>
+          <w:lang w:val="en-US" w:eastAsia="zh-CN"/>
+        </w:rPr>
+        <w:t>Implementation Logic:</w:t>
+      </w:r>
+    </w:p>
+    <w:p>
+      <w:pPr>
+        <w:jc w:val="left"/>
+        <w:rPr>
+          <w:rFonts w:hint="default" w:ascii="Arial" w:hAnsi="Arial" w:cs="Arial"/>
+          <w:b w:val="0"/>
+          <w:bCs w:val="0"/>
+          <w:sz w:val="24"/>
+          <w:szCs w:val="24"/>
+          <w:lang w:val="en-US" w:eastAsia="zh-CN"/>
+        </w:rPr>
+      </w:pPr>
+    </w:p>
+    <w:p>
+      <w:pPr>
+        <w:jc w:val="left"/>
+        <w:rPr>
+          <w:rFonts w:hint="default" w:ascii="Arial" w:hAnsi="Arial" w:cs="Arial"/>
+          <w:b w:val="0"/>
+          <w:bCs w:val="0"/>
+          <w:sz w:val="24"/>
+          <w:szCs w:val="24"/>
+          <w:lang w:val="en-US" w:eastAsia="zh-CN"/>
+        </w:rPr>
+      </w:pPr>
+      <w:r>
+        <w:rPr>
+          <w:rFonts w:hint="default" w:ascii="Arial" w:hAnsi="Arial" w:cs="Arial"/>
+          <w:b w:val="0"/>
+          <w:bCs w:val="0"/>
+          <w:sz w:val="24"/>
+          <w:szCs w:val="24"/>
+          <w:lang w:val="en-US" w:eastAsia="zh-CN"/>
+        </w:rPr>
+        <w:t>The functionality works as follows:</w:t>
+      </w:r>
+    </w:p>
+    <w:p>
+      <w:pPr>
+        <w:jc w:val="left"/>
+        <w:rPr>
+          <w:rFonts w:hint="default" w:ascii="Arial" w:hAnsi="Arial" w:cs="Arial"/>
+          <w:b w:val="0"/>
+          <w:bCs w:val="0"/>
+          <w:sz w:val="24"/>
+          <w:szCs w:val="24"/>
+          <w:lang w:val="en-US" w:eastAsia="zh-CN"/>
+        </w:rPr>
+      </w:pPr>
+      <w:r>
+        <w:rPr>
+          <w:rFonts w:hint="default" w:ascii="Arial" w:hAnsi="Arial" w:cs="Arial"/>
+          <w:b w:val="0"/>
+          <w:bCs w:val="0"/>
+          <w:sz w:val="24"/>
+          <w:szCs w:val="24"/>
+          <w:lang w:val="en-US" w:eastAsia="zh-CN"/>
+        </w:rPr>
+        <w:t>1. The user selects the Book Multiple Seats option from the menu.</w:t>
+      </w:r>
+    </w:p>
+    <w:p>
+      <w:pPr>
+        <w:jc w:val="left"/>
+        <w:rPr>
+          <w:rFonts w:hint="default" w:ascii="Arial" w:hAnsi="Arial" w:cs="Arial"/>
+          <w:b w:val="0"/>
+          <w:bCs w:val="0"/>
+          <w:sz w:val="24"/>
+          <w:szCs w:val="24"/>
+          <w:lang w:val="en-US" w:eastAsia="zh-CN"/>
+        </w:rPr>
+      </w:pPr>
+      <w:r>
+        <w:rPr>
+          <w:rFonts w:hint="default" w:ascii="Arial" w:hAnsi="Arial" w:cs="Arial"/>
+          <w:b w:val="0"/>
+          <w:bCs w:val="0"/>
+          <w:sz w:val="24"/>
+          <w:szCs w:val="24"/>
+          <w:lang w:val="en-US" w:eastAsia="zh-CN"/>
+        </w:rPr>
+        <w:t>2. The system asks the user how many seats they want to book.</w:t>
+      </w:r>
+    </w:p>
+    <w:p>
+      <w:pPr>
+        <w:jc w:val="left"/>
+        <w:rPr>
+          <w:rFonts w:hint="default" w:ascii="Arial" w:hAnsi="Arial" w:cs="Arial"/>
+          <w:b w:val="0"/>
+          <w:bCs w:val="0"/>
+          <w:sz w:val="24"/>
+          <w:szCs w:val="24"/>
+          <w:lang w:val="en-US" w:eastAsia="zh-CN"/>
+        </w:rPr>
+      </w:pPr>
+      <w:r>
+        <w:rPr>
+          <w:rFonts w:hint="default" w:ascii="Arial" w:hAnsi="Arial" w:cs="Arial"/>
+          <w:b w:val="0"/>
+          <w:bCs w:val="0"/>
+          <w:sz w:val="24"/>
+          <w:szCs w:val="24"/>
+          <w:lang w:val="en-US" w:eastAsia="zh-CN"/>
+        </w:rPr>
+        <w:t>3. The user enters the required seat numbers one by one.</w:t>
+      </w:r>
+    </w:p>
+    <w:p>
+      <w:pPr>
+        <w:jc w:val="left"/>
+        <w:rPr>
+          <w:rFonts w:hint="default" w:ascii="Arial" w:hAnsi="Arial" w:cs="Arial"/>
+          <w:b w:val="0"/>
+          <w:bCs w:val="0"/>
+          <w:sz w:val="24"/>
+          <w:szCs w:val="24"/>
+          <w:lang w:val="en-US" w:eastAsia="zh-CN"/>
+        </w:rPr>
+      </w:pPr>
+      <w:r>
+        <w:rPr>
+          <w:rFonts w:hint="default" w:ascii="Arial" w:hAnsi="Arial" w:cs="Arial"/>
+          <w:b w:val="0"/>
+          <w:bCs w:val="0"/>
+          <w:sz w:val="24"/>
+          <w:szCs w:val="24"/>
+          <w:lang w:val="en-US" w:eastAsia="zh-CN"/>
+        </w:rPr>
+        <w:t>4. For each seat entered, the system checks whether the seat code is valid.</w:t>
+      </w:r>
+    </w:p>
+    <w:p>
+      <w:pPr>
+        <w:jc w:val="left"/>
+        <w:rPr>
+          <w:rFonts w:hint="default" w:ascii="Arial" w:hAnsi="Arial" w:cs="Arial"/>
+          <w:b w:val="0"/>
+          <w:bCs w:val="0"/>
+          <w:sz w:val="24"/>
+          <w:szCs w:val="24"/>
+          <w:lang w:val="en-US" w:eastAsia="zh-CN"/>
+        </w:rPr>
+      </w:pPr>
+      <w:r>
+        <w:rPr>
+          <w:rFonts w:hint="default" w:ascii="Arial" w:hAnsi="Arial" w:cs="Arial"/>
+          <w:b w:val="0"/>
+          <w:bCs w:val="0"/>
+          <w:sz w:val="24"/>
+          <w:szCs w:val="24"/>
+          <w:lang w:val="en-US" w:eastAsia="zh-CN"/>
+        </w:rPr>
+        <w:t>5. The system then checks whether the selected position is a normal seat rather than an aisle (“X”) or storage area (“S”).</w:t>
+      </w:r>
+    </w:p>
+    <w:p>
+      <w:pPr>
+        <w:jc w:val="left"/>
+        <w:rPr>
+          <w:rFonts w:hint="default" w:ascii="Arial" w:hAnsi="Arial" w:cs="Arial"/>
+          <w:b w:val="0"/>
+          <w:bCs w:val="0"/>
+          <w:sz w:val="24"/>
+          <w:szCs w:val="24"/>
+          <w:lang w:val="en-US" w:eastAsia="zh-CN"/>
+        </w:rPr>
+      </w:pPr>
+      <w:r>
+        <w:rPr>
+          <w:rFonts w:hint="default" w:ascii="Arial" w:hAnsi="Arial" w:cs="Arial"/>
+          <w:b w:val="0"/>
+          <w:bCs w:val="0"/>
+          <w:sz w:val="24"/>
+          <w:szCs w:val="24"/>
+          <w:lang w:val="en-US" w:eastAsia="zh-CN"/>
+        </w:rPr>
+        <w:t>6. If the seat is available (“F”), the system changes its status to “R”.If the seat is already reserved, invalid, or restricted, the system displays an error message and skips that seat.</w:t>
+      </w:r>
+    </w:p>
+    <w:p>
+      <w:pPr>
+        <w:jc w:val="left"/>
+        <w:rPr>
+          <w:rFonts w:hint="default" w:ascii="Arial" w:hAnsi="Arial" w:cs="Arial"/>
+          <w:b w:val="0"/>
+          <w:bCs w:val="0"/>
+          <w:sz w:val="24"/>
+          <w:szCs w:val="24"/>
+          <w:lang w:val="en-US" w:eastAsia="zh-CN"/>
+        </w:rPr>
+      </w:pPr>
+      <w:r>
+        <w:rPr>
+          <w:rFonts w:hint="default" w:ascii="Arial" w:hAnsi="Arial" w:cs="Arial"/>
+          <w:b w:val="0"/>
+          <w:bCs w:val="0"/>
+          <w:sz w:val="24"/>
+          <w:szCs w:val="24"/>
+          <w:lang w:val="en-US" w:eastAsia="zh-CN"/>
+        </w:rPr>
+        <w:t>7.After all seat selections are processed, the system displays the updated seat layout.</w:t>
+      </w:r>
+    </w:p>
+    <w:p>
+      <w:pPr>
+        <w:jc w:val="left"/>
+        <w:rPr>
+          <w:rFonts w:hint="default" w:ascii="Arial" w:hAnsi="Arial" w:cs="Arial"/>
+          <w:b w:val="0"/>
+          <w:bCs w:val="0"/>
+          <w:sz w:val="24"/>
+          <w:szCs w:val="24"/>
+          <w:lang w:val="en-US" w:eastAsia="zh-CN"/>
+        </w:rPr>
+      </w:pPr>
+    </w:p>
+    <w:p>
+      <w:pPr>
+        <w:jc w:val="left"/>
+        <w:rPr>
+          <w:rFonts w:hint="default" w:ascii="Arial" w:hAnsi="Arial" w:cs="Arial"/>
+          <w:b w:val="0"/>
+          <w:bCs w:val="0"/>
+          <w:sz w:val="24"/>
+          <w:szCs w:val="24"/>
+          <w:lang w:val="en-US" w:eastAsia="zh-CN"/>
+        </w:rPr>
+      </w:pPr>
+      <w:r>
+        <w:rPr>
+          <w:rFonts w:hint="default" w:ascii="Arial" w:hAnsi="Arial" w:cs="Arial"/>
+          <w:b w:val="0"/>
+          <w:bCs w:val="0"/>
+          <w:sz w:val="24"/>
+          <w:szCs w:val="24"/>
+          <w:lang w:val="en-US" w:eastAsia="zh-CN"/>
+        </w:rPr>
+        <w:t>This additional functionality improves the usability of the application and reflects a common feature in real airline booking systems.</w:t>
+      </w:r>
+    </w:p>
+    <w:p>
+      <w:pPr>
+        <w:jc w:val="left"/>
+        <w:rPr>
+          <w:rFonts w:hint="default" w:ascii="Arial" w:hAnsi="Arial" w:cs="Arial"/>
+          <w:b w:val="0"/>
+          <w:bCs w:val="0"/>
+          <w:sz w:val="24"/>
+          <w:szCs w:val="24"/>
+          <w:lang w:val="en-US" w:eastAsia="zh-CN"/>
+        </w:rPr>
+      </w:pPr>
     </w:p>
     <w:p>
       <w:pPr>
@@ -2385,8 +2762,8 @@
     <w:lsdException w:unhideWhenUsed="0" w:uiPriority="0" w:semiHidden="0" w:name="Body Text Indent 2"/>
     <w:lsdException w:unhideWhenUsed="0" w:uiPriority="0" w:semiHidden="0" w:name="Body Text Indent 3"/>
     <w:lsdException w:unhideWhenUsed="0" w:uiPriority="0" w:semiHidden="0" w:name="Block Text"/>
-    <w:lsdException w:qFormat="1" w:unhideWhenUsed="0" w:uiPriority="0" w:semiHidden="0" w:name="Hyperlink"/>
-    <w:lsdException w:qFormat="1" w:unhideWhenUsed="0" w:uiPriority="0" w:semiHidden="0" w:name="FollowedHyperlink"/>
+    <w:lsdException w:unhideWhenUsed="0" w:uiPriority="0" w:semiHidden="0" w:name="Hyperlink"/>
+    <w:lsdException w:unhideWhenUsed="0" w:uiPriority="0" w:semiHidden="0" w:name="FollowedHyperlink"/>
     <w:lsdException w:qFormat="1" w:unhideWhenUsed="0" w:uiPriority="0" w:semiHidden="0" w:name="Strong"/>
     <w:lsdException w:qFormat="1" w:unhideWhenUsed="0" w:uiPriority="0" w:semiHidden="0" w:name="Emphasis"/>
     <w:lsdException w:unhideWhenUsed="0" w:uiPriority="0" w:semiHidden="0" w:name="Document Map"/>
@@ -2645,7 +3022,6 @@
   <w:style w:type="character" w:styleId="7">
     <w:name w:val="FollowedHyperlink"/>
     <w:basedOn w:val="6"/>
-    <w:qFormat/>
     <w:uiPriority w:val="0"/>
     <w:rPr>
       <w:color w:val="800080"/>
@@ -2655,7 +3031,6 @@
   <w:style w:type="character" w:styleId="8">
     <w:name w:val="Hyperlink"/>
     <w:basedOn w:val="6"/>
-    <w:qFormat/>
     <w:uiPriority w:val="0"/>
     <w:rPr>
       <w:color w:val="0000FF"/>

</xml_diff>

<commit_message>
Commit: Refactor booking system to support unique booking references and database storage. (Part B) 1. Implement algorithm to generate a unique 8-character alphanumeric booking reference. 2. Store booking reference in the seat data structure instead of the letter "R". 3. Integrate SQLite database to store passenger details and seat information. 4. Insert booking records into the database when a seat is booked. 5. Remove booking records from the database when a seat is freed. 6. Add functionality to search booking details using a booking reference. 7. The activity diagram was updated
</commit_message>
<xml_diff>
--- a/FC723 Project – Documentation/Documentation.docx
+++ b/FC723 Project – Documentation/Documentation.docx
@@ -1353,7 +1353,95 @@
           <w:szCs w:val="24"/>
           <w:lang w:val="en-US" w:eastAsia="zh-CN"/>
         </w:rPr>
-        <w:t>The seat-booking system was implemented using the Python. The program provides a menu interface that allows users to interact with the system and perform some seat management operations.The system continuously displays a menu until the user selects the exit option. Each menu option corresponds to a specific function in the program.The implemented functionalities include:</w:t>
+        <w:t xml:space="preserve">The seat-booking system was implemented using the Python. The program </w:t>
+      </w:r>
+      <w:r>
+        <w:rPr>
+          <w:rFonts w:hint="eastAsia" w:ascii="Arial" w:hAnsi="Arial" w:cs="Arial"/>
+          <w:b w:val="0"/>
+          <w:bCs w:val="0"/>
+          <w:sz w:val="24"/>
+          <w:szCs w:val="24"/>
+          <w:lang w:val="en-US" w:eastAsia="zh-CN"/>
+        </w:rPr>
+        <w:t xml:space="preserve">is a </w:t>
+      </w:r>
+      <w:r>
+        <w:rPr>
+          <w:rFonts w:hint="default" w:ascii="Arial" w:hAnsi="Arial" w:cs="Arial"/>
+          <w:b w:val="0"/>
+          <w:bCs w:val="0"/>
+          <w:sz w:val="24"/>
+          <w:szCs w:val="24"/>
+          <w:lang w:val="en-US" w:eastAsia="zh-CN"/>
+        </w:rPr>
+        <w:fldChar w:fldCharType="begin"/>
+      </w:r>
+      <w:r>
+        <w:rPr>
+          <w:rFonts w:hint="default" w:ascii="Arial" w:hAnsi="Arial" w:cs="Arial"/>
+          <w:b w:val="0"/>
+          <w:bCs w:val="0"/>
+          <w:sz w:val="24"/>
+          <w:szCs w:val="24"/>
+          <w:lang w:val="en-US" w:eastAsia="zh-CN"/>
+        </w:rPr>
+        <w:instrText xml:space="preserve"> HYPERLINK "https://github.com/zeshuochen/apache-airlines-seat-booking/commit/3185ad5f07db930c5d42dece3977c5bd9ddce437" \o "Commit: Build minimum viable product (MVP) seat booking menu and core operations.1. Check availability of seat2. Book a seat3. Free a seat4. Show booking status5. Exit program" </w:instrText>
+      </w:r>
+      <w:r>
+        <w:rPr>
+          <w:rFonts w:hint="default" w:ascii="Arial" w:hAnsi="Arial" w:cs="Arial"/>
+          <w:b w:val="0"/>
+          <w:bCs w:val="0"/>
+          <w:sz w:val="24"/>
+          <w:szCs w:val="24"/>
+          <w:lang w:val="en-US" w:eastAsia="zh-CN"/>
+        </w:rPr>
+        <w:fldChar w:fldCharType="separate"/>
+      </w:r>
+      <w:r>
+        <w:rPr>
+          <w:rFonts w:hint="default" w:ascii="Arial" w:hAnsi="Arial" w:cs="Arial"/>
+          <w:b w:val="0"/>
+          <w:bCs w:val="0"/>
+          <w:sz w:val="24"/>
+          <w:szCs w:val="24"/>
+          <w:lang w:val="en-US" w:eastAsia="zh-CN"/>
+        </w:rPr>
+        <w:t>minimum viable product (MVP)</w:t>
+      </w:r>
+      <w:r>
+        <w:rPr>
+          <w:rFonts w:hint="default" w:ascii="Arial" w:hAnsi="Arial" w:cs="Arial"/>
+          <w:b w:val="0"/>
+          <w:bCs w:val="0"/>
+          <w:sz w:val="24"/>
+          <w:szCs w:val="24"/>
+          <w:lang w:val="en-US" w:eastAsia="zh-CN"/>
+        </w:rPr>
+        <w:fldChar w:fldCharType="end"/>
+      </w:r>
+      <w:r>
+        <w:rPr>
+          <w:rFonts w:hint="eastAsia" w:ascii="Arial" w:hAnsi="Arial" w:cs="Arial"/>
+          <w:b w:val="0"/>
+          <w:bCs w:val="0"/>
+          <w:sz w:val="24"/>
+          <w:szCs w:val="24"/>
+          <w:lang w:val="en-US" w:eastAsia="zh-CN"/>
+        </w:rPr>
+        <w:t xml:space="preserve"> , which </w:t>
+      </w:r>
+      <w:r>
+        <w:rPr>
+          <w:rFonts w:hint="default" w:ascii="Arial" w:hAnsi="Arial" w:cs="Arial"/>
+          <w:b w:val="0"/>
+          <w:bCs w:val="0"/>
+          <w:sz w:val="24"/>
+          <w:szCs w:val="24"/>
+          <w:lang w:val="en-US" w:eastAsia="zh-CN"/>
+        </w:rPr>
+        <w:t>provides a menu interface that allows users to interact with the system and perform some seat management operations.The system continuously displays a menu until the user selects the exit option. Each menu option corresponds to a specific function in the program.The implemented functionalities include:</w:t>
       </w:r>
     </w:p>
     <w:p>
@@ -1573,998 +1661,2056 @@
           <w:lang w:val="en-US" w:eastAsia="zh-CN"/>
         </w:rPr>
       </w:pPr>
+    </w:p>
+    <w:p>
+      <w:pPr>
+        <w:jc w:val="left"/>
+        <w:rPr>
+          <w:rFonts w:hint="default" w:ascii="Arial" w:hAnsi="Arial" w:cs="Arial"/>
+          <w:b w:val="0"/>
+          <w:bCs w:val="0"/>
+          <w:sz w:val="24"/>
+          <w:szCs w:val="24"/>
+          <w:lang w:val="en-US" w:eastAsia="zh-CN"/>
+        </w:rPr>
+      </w:pPr>
+      <w:r>
+        <w:rPr>
+          <w:rFonts w:hint="default" w:ascii="Arial" w:hAnsi="Arial" w:cs="Arial"/>
+          <w:b w:val="0"/>
+          <w:bCs w:val="0"/>
+          <w:sz w:val="24"/>
+          <w:szCs w:val="24"/>
+          <w:lang w:val="en-US" w:eastAsia="zh-CN"/>
+        </w:rPr>
+        <w:t>A.5 Additional functionality implementation</w:t>
+      </w:r>
+    </w:p>
+    <w:p>
+      <w:pPr>
+        <w:jc w:val="left"/>
+        <w:rPr>
+          <w:rFonts w:hint="default" w:ascii="Arial" w:hAnsi="Arial" w:cs="Arial"/>
+          <w:b w:val="0"/>
+          <w:bCs w:val="0"/>
+          <w:sz w:val="24"/>
+          <w:szCs w:val="24"/>
+          <w:lang w:val="en-US" w:eastAsia="zh-CN"/>
+        </w:rPr>
+      </w:pPr>
+      <w:r>
+        <w:rPr>
+          <w:rFonts w:hint="default" w:ascii="Arial" w:hAnsi="Arial" w:cs="Arial"/>
+          <w:b w:val="0"/>
+          <w:bCs w:val="0"/>
+          <w:sz w:val="24"/>
+          <w:szCs w:val="24"/>
+          <w:lang w:val="en-US" w:eastAsia="zh-CN"/>
+        </w:rPr>
+        <w:t>In addition to the required functionalities, an extra feature called “” was implemented.</w:t>
+      </w:r>
+    </w:p>
+    <w:p>
+      <w:pPr>
+        <w:jc w:val="left"/>
+        <w:rPr>
+          <w:rFonts w:hint="default" w:ascii="Arial" w:hAnsi="Arial" w:cs="Arial"/>
+          <w:b w:val="0"/>
+          <w:bCs w:val="0"/>
+          <w:sz w:val="24"/>
+          <w:szCs w:val="24"/>
+          <w:lang w:val="en-US" w:eastAsia="zh-CN"/>
+        </w:rPr>
+      </w:pPr>
+    </w:p>
+    <w:p>
+      <w:pPr>
+        <w:jc w:val="left"/>
+        <w:rPr>
+          <w:rFonts w:hint="default" w:ascii="Arial" w:hAnsi="Arial" w:cs="Arial"/>
+          <w:b w:val="0"/>
+          <w:bCs w:val="0"/>
+          <w:sz w:val="24"/>
+          <w:szCs w:val="24"/>
+          <w:lang w:val="en-US" w:eastAsia="zh-CN"/>
+        </w:rPr>
+      </w:pPr>
+      <w:r>
+        <w:rPr>
+          <w:rFonts w:hint="default" w:ascii="Arial" w:hAnsi="Arial" w:cs="Arial"/>
+          <w:b w:val="0"/>
+          <w:bCs w:val="0"/>
+          <w:sz w:val="24"/>
+          <w:szCs w:val="24"/>
+          <w:lang w:val="en-US" w:eastAsia="zh-CN"/>
+        </w:rPr>
+        <w:t>This functionality allows a user to reserve more than one seat in a single operation. This is a common feature in airline booking systems because passengers often travel with friends, family members, or in small groups.</w:t>
+      </w:r>
+    </w:p>
+    <w:p>
+      <w:pPr>
+        <w:jc w:val="left"/>
+        <w:rPr>
+          <w:rFonts w:hint="default" w:ascii="Arial" w:hAnsi="Arial" w:cs="Arial"/>
+          <w:b w:val="0"/>
+          <w:bCs w:val="0"/>
+          <w:sz w:val="24"/>
+          <w:szCs w:val="24"/>
+          <w:lang w:val="en-US" w:eastAsia="zh-CN"/>
+        </w:rPr>
+      </w:pPr>
+    </w:p>
+    <w:p>
+      <w:pPr>
+        <w:jc w:val="left"/>
+        <w:rPr>
+          <w:rFonts w:hint="default" w:ascii="Arial" w:hAnsi="Arial" w:cs="Arial"/>
+          <w:b w:val="0"/>
+          <w:bCs w:val="0"/>
+          <w:sz w:val="24"/>
+          <w:szCs w:val="24"/>
+          <w:lang w:val="en-US" w:eastAsia="zh-CN"/>
+        </w:rPr>
+      </w:pPr>
+      <w:r>
+        <w:rPr>
+          <w:rFonts w:hint="default" w:ascii="Arial" w:hAnsi="Arial" w:cs="Arial"/>
+          <w:b w:val="0"/>
+          <w:bCs w:val="0"/>
+          <w:sz w:val="24"/>
+          <w:szCs w:val="24"/>
+          <w:lang w:val="en-US" w:eastAsia="zh-CN"/>
+        </w:rPr>
+        <w:t>The purpose of this feature is to improve convenience and reduce repetition. Without this function, a user would need to repeat the booking process several times when reserving seats for a group. By allowing multiple seat selections in one process, the system becomes more efficient and user-friendly.</w:t>
+      </w:r>
+    </w:p>
+    <w:p>
+      <w:pPr>
+        <w:jc w:val="left"/>
+        <w:rPr>
+          <w:rFonts w:hint="default" w:ascii="Arial" w:hAnsi="Arial" w:cs="Arial"/>
+          <w:b w:val="0"/>
+          <w:bCs w:val="0"/>
+          <w:sz w:val="24"/>
+          <w:szCs w:val="24"/>
+          <w:lang w:val="en-US" w:eastAsia="zh-CN"/>
+        </w:rPr>
+      </w:pPr>
+    </w:p>
+    <w:p>
+      <w:pPr>
+        <w:jc w:val="left"/>
+        <w:rPr>
+          <w:rFonts w:hint="default" w:ascii="Arial" w:hAnsi="Arial" w:cs="Arial"/>
+          <w:b w:val="0"/>
+          <w:bCs w:val="0"/>
+          <w:sz w:val="24"/>
+          <w:szCs w:val="24"/>
+          <w:lang w:val="en-US" w:eastAsia="zh-CN"/>
+        </w:rPr>
+      </w:pPr>
+      <w:r>
+        <w:rPr>
+          <w:rFonts w:hint="default" w:ascii="Arial" w:hAnsi="Arial" w:cs="Arial"/>
+          <w:b w:val="0"/>
+          <w:bCs w:val="0"/>
+          <w:sz w:val="24"/>
+          <w:szCs w:val="24"/>
+          <w:lang w:val="en-US" w:eastAsia="zh-CN"/>
+        </w:rPr>
+        <w:t>The functionality works as follows:</w:t>
+      </w:r>
+    </w:p>
+    <w:p>
+      <w:pPr>
+        <w:jc w:val="left"/>
+        <w:rPr>
+          <w:rFonts w:hint="default" w:ascii="Arial" w:hAnsi="Arial" w:cs="Arial"/>
+          <w:b w:val="0"/>
+          <w:bCs w:val="0"/>
+          <w:sz w:val="24"/>
+          <w:szCs w:val="24"/>
+          <w:lang w:val="en-US" w:eastAsia="zh-CN"/>
+        </w:rPr>
+      </w:pPr>
+    </w:p>
+    <w:p>
+      <w:pPr>
+        <w:jc w:val="left"/>
+        <w:rPr>
+          <w:rFonts w:hint="default" w:ascii="Arial" w:hAnsi="Arial" w:cs="Arial"/>
+          <w:b w:val="0"/>
+          <w:bCs w:val="0"/>
+          <w:sz w:val="24"/>
+          <w:szCs w:val="24"/>
+          <w:lang w:val="en-US" w:eastAsia="zh-CN"/>
+        </w:rPr>
+      </w:pPr>
+      <w:r>
+        <w:rPr>
+          <w:rFonts w:hint="default" w:ascii="Arial" w:hAnsi="Arial" w:cs="Arial"/>
+          <w:b w:val="0"/>
+          <w:bCs w:val="0"/>
+          <w:sz w:val="24"/>
+          <w:szCs w:val="24"/>
+          <w:lang w:val="en-US" w:eastAsia="zh-CN"/>
+        </w:rPr>
+        <w:t>1. The user selects the Book Multiple Seats option from the menu.</w:t>
+      </w:r>
+    </w:p>
+    <w:p>
+      <w:pPr>
+        <w:jc w:val="left"/>
+        <w:rPr>
+          <w:rFonts w:hint="default" w:ascii="Arial" w:hAnsi="Arial" w:cs="Arial"/>
+          <w:b w:val="0"/>
+          <w:bCs w:val="0"/>
+          <w:sz w:val="24"/>
+          <w:szCs w:val="24"/>
+          <w:lang w:val="en-US" w:eastAsia="zh-CN"/>
+        </w:rPr>
+      </w:pPr>
+      <w:r>
+        <w:rPr>
+          <w:rFonts w:hint="default" w:ascii="Arial" w:hAnsi="Arial" w:cs="Arial"/>
+          <w:b w:val="0"/>
+          <w:bCs w:val="0"/>
+          <w:sz w:val="24"/>
+          <w:szCs w:val="24"/>
+          <w:lang w:val="en-US" w:eastAsia="zh-CN"/>
+        </w:rPr>
+        <w:t>2. The system asks the user how many seats they want to book.</w:t>
+      </w:r>
+    </w:p>
+    <w:p>
+      <w:pPr>
+        <w:jc w:val="left"/>
+        <w:rPr>
+          <w:rFonts w:hint="default" w:ascii="Arial" w:hAnsi="Arial" w:cs="Arial"/>
+          <w:b w:val="0"/>
+          <w:bCs w:val="0"/>
+          <w:sz w:val="24"/>
+          <w:szCs w:val="24"/>
+          <w:lang w:val="en-US" w:eastAsia="zh-CN"/>
+        </w:rPr>
+      </w:pPr>
+      <w:r>
+        <w:rPr>
+          <w:rFonts w:hint="default" w:ascii="Arial" w:hAnsi="Arial" w:cs="Arial"/>
+          <w:b w:val="0"/>
+          <w:bCs w:val="0"/>
+          <w:sz w:val="24"/>
+          <w:szCs w:val="24"/>
+          <w:lang w:val="en-US" w:eastAsia="zh-CN"/>
+        </w:rPr>
+        <w:t>3. The user enters the required seat numbers one by one.</w:t>
+      </w:r>
+    </w:p>
+    <w:p>
+      <w:pPr>
+        <w:jc w:val="left"/>
+        <w:rPr>
+          <w:rFonts w:hint="default" w:ascii="Arial" w:hAnsi="Arial" w:cs="Arial"/>
+          <w:b w:val="0"/>
+          <w:bCs w:val="0"/>
+          <w:sz w:val="24"/>
+          <w:szCs w:val="24"/>
+          <w:lang w:val="en-US" w:eastAsia="zh-CN"/>
+        </w:rPr>
+      </w:pPr>
+      <w:r>
+        <w:rPr>
+          <w:rFonts w:hint="default" w:ascii="Arial" w:hAnsi="Arial" w:cs="Arial"/>
+          <w:b w:val="0"/>
+          <w:bCs w:val="0"/>
+          <w:sz w:val="24"/>
+          <w:szCs w:val="24"/>
+          <w:lang w:val="en-US" w:eastAsia="zh-CN"/>
+        </w:rPr>
+        <w:t>4. For each seat entered, the system checks whether the seat code is valid.</w:t>
+      </w:r>
+    </w:p>
+    <w:p>
+      <w:pPr>
+        <w:jc w:val="left"/>
+        <w:rPr>
+          <w:rFonts w:hint="default" w:ascii="Arial" w:hAnsi="Arial" w:cs="Arial"/>
+          <w:b w:val="0"/>
+          <w:bCs w:val="0"/>
+          <w:sz w:val="24"/>
+          <w:szCs w:val="24"/>
+          <w:lang w:val="en-US" w:eastAsia="zh-CN"/>
+        </w:rPr>
+      </w:pPr>
+      <w:r>
+        <w:rPr>
+          <w:rFonts w:hint="default" w:ascii="Arial" w:hAnsi="Arial" w:cs="Arial"/>
+          <w:b w:val="0"/>
+          <w:bCs w:val="0"/>
+          <w:sz w:val="24"/>
+          <w:szCs w:val="24"/>
+          <w:lang w:val="en-US" w:eastAsia="zh-CN"/>
+        </w:rPr>
+        <w:t>5. The system then checks whether the selected position is a normal seat rather than an aisle (“X”) or storage area (“S”).</w:t>
+      </w:r>
+    </w:p>
+    <w:p>
+      <w:pPr>
+        <w:jc w:val="left"/>
+        <w:rPr>
+          <w:rFonts w:hint="default" w:ascii="Arial" w:hAnsi="Arial" w:cs="Arial"/>
+          <w:b w:val="0"/>
+          <w:bCs w:val="0"/>
+          <w:sz w:val="24"/>
+          <w:szCs w:val="24"/>
+          <w:lang w:val="en-US" w:eastAsia="zh-CN"/>
+        </w:rPr>
+      </w:pPr>
+      <w:r>
+        <w:rPr>
+          <w:rFonts w:hint="default" w:ascii="Arial" w:hAnsi="Arial" w:cs="Arial"/>
+          <w:b w:val="0"/>
+          <w:bCs w:val="0"/>
+          <w:sz w:val="24"/>
+          <w:szCs w:val="24"/>
+          <w:lang w:val="en-US" w:eastAsia="zh-CN"/>
+        </w:rPr>
+        <w:t>6. If the seat is available (“F”), the system changes its status to “R”.If the seat is already reserved, invalid, or restricted, the system displays an error message and skips that seat.</w:t>
+      </w:r>
+    </w:p>
+    <w:p>
+      <w:pPr>
+        <w:jc w:val="left"/>
+        <w:rPr>
+          <w:rFonts w:hint="default" w:ascii="Arial" w:hAnsi="Arial" w:cs="Arial"/>
+          <w:b w:val="0"/>
+          <w:bCs w:val="0"/>
+          <w:sz w:val="24"/>
+          <w:szCs w:val="24"/>
+          <w:lang w:val="en-US" w:eastAsia="zh-CN"/>
+        </w:rPr>
+      </w:pPr>
+      <w:r>
+        <w:rPr>
+          <w:rFonts w:hint="default" w:ascii="Arial" w:hAnsi="Arial" w:cs="Arial"/>
+          <w:b w:val="0"/>
+          <w:bCs w:val="0"/>
+          <w:sz w:val="24"/>
+          <w:szCs w:val="24"/>
+          <w:lang w:val="en-US" w:eastAsia="zh-CN"/>
+        </w:rPr>
+        <w:t>7.After all seat selections are processed, the system displays the updated seat layout.</w:t>
+      </w:r>
+    </w:p>
+    <w:p>
+      <w:pPr>
+        <w:jc w:val="left"/>
+        <w:rPr>
+          <w:rFonts w:hint="default" w:ascii="Arial" w:hAnsi="Arial" w:cs="Arial"/>
+          <w:b w:val="0"/>
+          <w:bCs w:val="0"/>
+          <w:sz w:val="24"/>
+          <w:szCs w:val="24"/>
+          <w:lang w:val="en-US" w:eastAsia="zh-CN"/>
+        </w:rPr>
+      </w:pPr>
+    </w:p>
+    <w:p>
+      <w:pPr>
+        <w:jc w:val="left"/>
+        <w:rPr>
+          <w:rFonts w:hint="default" w:ascii="Arial" w:hAnsi="Arial" w:cs="Arial"/>
+          <w:b w:val="0"/>
+          <w:bCs w:val="0"/>
+          <w:sz w:val="24"/>
+          <w:szCs w:val="24"/>
+          <w:lang w:val="en-US" w:eastAsia="zh-CN"/>
+        </w:rPr>
+      </w:pPr>
+      <w:r>
+        <w:rPr>
+          <w:rFonts w:hint="default" w:ascii="Arial" w:hAnsi="Arial" w:cs="Arial"/>
+          <w:b w:val="0"/>
+          <w:bCs w:val="0"/>
+          <w:sz w:val="24"/>
+          <w:szCs w:val="24"/>
+          <w:lang w:val="en-US" w:eastAsia="zh-CN"/>
+        </w:rPr>
+        <w:t>This additional functionality improves the usability of the application and reflects a common feature in real airline booking systems.</w:t>
+      </w:r>
+    </w:p>
+    <w:p>
+      <w:pPr>
+        <w:jc w:val="left"/>
+        <w:rPr>
+          <w:rFonts w:hint="default" w:ascii="Arial" w:hAnsi="Arial" w:cs="Arial"/>
+          <w:b w:val="0"/>
+          <w:bCs w:val="0"/>
+          <w:sz w:val="24"/>
+          <w:szCs w:val="24"/>
+          <w:lang w:val="en-US" w:eastAsia="zh-CN"/>
+        </w:rPr>
+      </w:pPr>
+    </w:p>
+    <w:p>
+      <w:pPr>
+        <w:jc w:val="left"/>
+        <w:rPr>
+          <w:rFonts w:hint="default" w:ascii="Arial" w:hAnsi="Arial" w:cs="Arial"/>
+          <w:b w:val="0"/>
+          <w:bCs w:val="0"/>
+          <w:sz w:val="24"/>
+          <w:szCs w:val="24"/>
+          <w:lang w:val="en-US" w:eastAsia="zh-CN"/>
+        </w:rPr>
+      </w:pPr>
+    </w:p>
+    <w:p>
+      <w:pPr>
+        <w:jc w:val="left"/>
+        <w:rPr>
+          <w:rFonts w:hint="eastAsia" w:ascii="Arial" w:hAnsi="Arial" w:cs="Arial"/>
+          <w:b w:val="0"/>
+          <w:bCs w:val="0"/>
+          <w:sz w:val="24"/>
+          <w:szCs w:val="24"/>
+          <w:lang w:val="en-US" w:eastAsia="zh-CN"/>
+        </w:rPr>
+      </w:pPr>
+      <w:r>
+        <w:rPr>
+          <w:rFonts w:hint="eastAsia" w:ascii="Arial" w:hAnsi="Arial" w:cs="Arial"/>
+          <w:b w:val="0"/>
+          <w:bCs w:val="0"/>
+          <w:sz w:val="24"/>
+          <w:szCs w:val="24"/>
+          <w:lang w:val="en-US" w:eastAsia="zh-CN"/>
+        </w:rPr>
+        <w:t>A.6 Version control using GitHub</w:t>
+      </w:r>
+    </w:p>
+    <w:p>
+      <w:pPr>
+        <w:jc w:val="left"/>
+        <w:rPr>
+          <w:rFonts w:hint="eastAsia" w:ascii="Arial" w:hAnsi="Arial" w:cs="Arial"/>
+          <w:b w:val="0"/>
+          <w:bCs w:val="0"/>
+          <w:sz w:val="24"/>
+          <w:szCs w:val="24"/>
+          <w:lang w:val="en-US" w:eastAsia="zh-CN"/>
+        </w:rPr>
+      </w:pPr>
+      <w:r>
+        <w:rPr>
+          <w:rFonts w:hint="eastAsia" w:ascii="Arial" w:hAnsi="Arial" w:cs="Arial"/>
+          <w:b w:val="0"/>
+          <w:bCs w:val="0"/>
+          <w:sz w:val="24"/>
+          <w:szCs w:val="24"/>
+          <w:lang w:val="en-US" w:eastAsia="zh-CN"/>
+        </w:rPr>
+        <w:t>To maintain version control of the project, a public GitHub repository was created. The following steps were followed to upload the code to GitHub.</w:t>
+      </w:r>
+    </w:p>
+    <w:p>
+      <w:pPr>
+        <w:jc w:val="left"/>
+        <w:rPr>
+          <w:rFonts w:hint="eastAsia" w:ascii="Arial" w:hAnsi="Arial" w:cs="Arial"/>
+          <w:b w:val="0"/>
+          <w:bCs w:val="0"/>
+          <w:sz w:val="24"/>
+          <w:szCs w:val="24"/>
+          <w:lang w:val="en-US" w:eastAsia="zh-CN"/>
+        </w:rPr>
+      </w:pPr>
+    </w:p>
+    <w:p>
+      <w:pPr>
+        <w:jc w:val="left"/>
+        <w:rPr>
+          <w:rFonts w:hint="eastAsia" w:ascii="Arial" w:hAnsi="Arial" w:cs="Arial"/>
+          <w:b w:val="0"/>
+          <w:bCs w:val="0"/>
+          <w:sz w:val="24"/>
+          <w:szCs w:val="24"/>
+          <w:lang w:val="en-US" w:eastAsia="zh-CN"/>
+        </w:rPr>
+      </w:pPr>
+      <w:r>
+        <w:rPr>
+          <w:rFonts w:hint="eastAsia" w:ascii="Arial" w:hAnsi="Arial" w:cs="Arial"/>
+          <w:b w:val="0"/>
+          <w:bCs w:val="0"/>
+          <w:sz w:val="24"/>
+          <w:szCs w:val="24"/>
+          <w:lang w:val="en-US" w:eastAsia="zh-CN"/>
+        </w:rPr>
+        <w:t>1. Create a repository</w:t>
+      </w:r>
+    </w:p>
+    <w:p>
+      <w:pPr>
+        <w:jc w:val="left"/>
+        <w:rPr>
+          <w:rFonts w:hint="eastAsia" w:ascii="Arial" w:hAnsi="Arial" w:cs="Arial"/>
+          <w:b w:val="0"/>
+          <w:bCs w:val="0"/>
+          <w:sz w:val="24"/>
+          <w:szCs w:val="24"/>
+          <w:lang w:val="en-US" w:eastAsia="zh-CN"/>
+        </w:rPr>
+      </w:pPr>
+      <w:r>
+        <w:rPr>
+          <w:rFonts w:hint="eastAsia" w:ascii="Arial" w:hAnsi="Arial" w:cs="Arial"/>
+          <w:b w:val="0"/>
+          <w:bCs w:val="0"/>
+          <w:sz w:val="24"/>
+          <w:szCs w:val="24"/>
+          <w:lang w:val="en-US" w:eastAsia="zh-CN"/>
+        </w:rPr>
+        <w:t>A new repository was created on GitHub under my account. The repository was named:apache-airlines-seat-booking</w:t>
+      </w:r>
+    </w:p>
+    <w:p>
+      <w:pPr>
+        <w:jc w:val="left"/>
+        <w:rPr>
+          <w:rFonts w:hint="eastAsia" w:ascii="Arial" w:hAnsi="Arial" w:cs="Arial"/>
+          <w:b w:val="0"/>
+          <w:bCs w:val="0"/>
+          <w:sz w:val="24"/>
+          <w:szCs w:val="24"/>
+          <w:lang w:val="en-US" w:eastAsia="zh-CN"/>
+        </w:rPr>
+      </w:pPr>
+    </w:p>
+    <w:p>
+      <w:pPr>
+        <w:jc w:val="left"/>
+        <w:rPr>
+          <w:rFonts w:hint="eastAsia" w:ascii="Arial" w:hAnsi="Arial" w:cs="Arial"/>
+          <w:b w:val="0"/>
+          <w:bCs w:val="0"/>
+          <w:sz w:val="24"/>
+          <w:szCs w:val="24"/>
+          <w:lang w:val="en-US" w:eastAsia="zh-CN"/>
+        </w:rPr>
+      </w:pPr>
+      <w:r>
+        <w:rPr>
+          <w:rFonts w:hint="eastAsia" w:ascii="Arial" w:hAnsi="Arial" w:cs="Arial"/>
+          <w:b w:val="0"/>
+          <w:bCs w:val="0"/>
+          <w:sz w:val="24"/>
+          <w:szCs w:val="24"/>
+          <w:lang w:val="en-US" w:eastAsia="zh-CN"/>
+        </w:rPr>
+        <w:t>2. Initialize Git in the project folder</w:t>
+      </w:r>
+    </w:p>
+    <w:p>
+      <w:pPr>
+        <w:jc w:val="left"/>
+        <w:rPr>
+          <w:rFonts w:hint="eastAsia" w:ascii="Arial" w:hAnsi="Arial" w:cs="Arial"/>
+          <w:b w:val="0"/>
+          <w:bCs w:val="0"/>
+          <w:sz w:val="24"/>
+          <w:szCs w:val="24"/>
+          <w:lang w:val="en-US" w:eastAsia="zh-CN"/>
+        </w:rPr>
+      </w:pPr>
+      <w:r>
+        <w:rPr>
+          <w:rFonts w:hint="eastAsia" w:ascii="Arial" w:hAnsi="Arial" w:cs="Arial"/>
+          <w:b w:val="0"/>
+          <w:bCs w:val="0"/>
+          <w:sz w:val="24"/>
+          <w:szCs w:val="24"/>
+          <w:lang w:val="en-US" w:eastAsia="zh-CN"/>
+        </w:rPr>
+        <w:t>Inside the project directory, Git was initialized using the command:</w:t>
+      </w:r>
+    </w:p>
+    <w:p>
+      <w:pPr>
+        <w:jc w:val="left"/>
+        <w:rPr>
+          <w:rFonts w:hint="eastAsia" w:ascii="Arial" w:hAnsi="Arial" w:cs="Arial"/>
+          <w:b w:val="0"/>
+          <w:bCs w:val="0"/>
+          <w:sz w:val="24"/>
+          <w:szCs w:val="24"/>
+          <w:lang w:val="en-US" w:eastAsia="zh-CN"/>
+        </w:rPr>
+      </w:pPr>
+      <w:r>
+        <w:rPr>
+          <w:rFonts w:hint="eastAsia" w:ascii="Arial" w:hAnsi="Arial" w:cs="Arial"/>
+          <w:b w:val="0"/>
+          <w:bCs w:val="0"/>
+          <w:sz w:val="24"/>
+          <w:szCs w:val="24"/>
+          <w:lang w:val="en-US" w:eastAsia="zh-CN"/>
+        </w:rPr>
+        <w:t>"git init"</w:t>
+      </w:r>
+    </w:p>
+    <w:p>
+      <w:pPr>
+        <w:jc w:val="left"/>
+        <w:rPr>
+          <w:rFonts w:hint="eastAsia" w:ascii="Arial" w:hAnsi="Arial" w:cs="Arial"/>
+          <w:b w:val="0"/>
+          <w:bCs w:val="0"/>
+          <w:sz w:val="24"/>
+          <w:szCs w:val="24"/>
+          <w:lang w:val="en-US" w:eastAsia="zh-CN"/>
+        </w:rPr>
+      </w:pPr>
+    </w:p>
+    <w:p>
+      <w:pPr>
+        <w:jc w:val="left"/>
+        <w:rPr>
+          <w:rFonts w:hint="eastAsia" w:ascii="Arial" w:hAnsi="Arial" w:cs="Arial"/>
+          <w:b w:val="0"/>
+          <w:bCs w:val="0"/>
+          <w:sz w:val="24"/>
+          <w:szCs w:val="24"/>
+          <w:lang w:val="en-US" w:eastAsia="zh-CN"/>
+        </w:rPr>
+      </w:pPr>
+      <w:r>
+        <w:rPr>
+          <w:rFonts w:hint="eastAsia" w:ascii="Arial" w:hAnsi="Arial" w:cs="Arial"/>
+          <w:b w:val="0"/>
+          <w:bCs w:val="0"/>
+          <w:sz w:val="24"/>
+          <w:szCs w:val="24"/>
+          <w:lang w:val="en-US" w:eastAsia="zh-CN"/>
+        </w:rPr>
+        <w:t>3. Add project files</w:t>
+      </w:r>
+    </w:p>
+    <w:p>
+      <w:pPr>
+        <w:jc w:val="left"/>
+        <w:rPr>
+          <w:rFonts w:hint="eastAsia" w:ascii="Arial" w:hAnsi="Arial" w:cs="Arial"/>
+          <w:b w:val="0"/>
+          <w:bCs w:val="0"/>
+          <w:sz w:val="24"/>
+          <w:szCs w:val="24"/>
+          <w:lang w:val="en-US" w:eastAsia="zh-CN"/>
+        </w:rPr>
+      </w:pPr>
+      <w:r>
+        <w:rPr>
+          <w:rFonts w:hint="eastAsia" w:ascii="Arial" w:hAnsi="Arial" w:cs="Arial"/>
+          <w:b w:val="0"/>
+          <w:bCs w:val="0"/>
+          <w:sz w:val="24"/>
+          <w:szCs w:val="24"/>
+          <w:lang w:val="en-US" w:eastAsia="zh-CN"/>
+        </w:rPr>
+        <w:t>All Python source files were added to the staging area using:</w:t>
+      </w:r>
+    </w:p>
+    <w:p>
+      <w:pPr>
+        <w:jc w:val="left"/>
+        <w:rPr>
+          <w:rFonts w:hint="eastAsia" w:ascii="Arial" w:hAnsi="Arial" w:cs="Arial"/>
+          <w:b w:val="0"/>
+          <w:bCs w:val="0"/>
+          <w:sz w:val="24"/>
+          <w:szCs w:val="24"/>
+          <w:lang w:val="en-US" w:eastAsia="zh-CN"/>
+        </w:rPr>
+      </w:pPr>
+      <w:r>
+        <w:rPr>
+          <w:rFonts w:hint="eastAsia" w:ascii="Arial" w:hAnsi="Arial" w:cs="Arial"/>
+          <w:b w:val="0"/>
+          <w:bCs w:val="0"/>
+          <w:sz w:val="24"/>
+          <w:szCs w:val="24"/>
+          <w:lang w:val="en-US" w:eastAsia="zh-CN"/>
+        </w:rPr>
+        <w:t>"git add ."</w:t>
+      </w:r>
+    </w:p>
+    <w:p>
+      <w:pPr>
+        <w:jc w:val="left"/>
+        <w:rPr>
+          <w:rFonts w:hint="eastAsia" w:ascii="Arial" w:hAnsi="Arial" w:cs="Arial"/>
+          <w:b w:val="0"/>
+          <w:bCs w:val="0"/>
+          <w:sz w:val="24"/>
+          <w:szCs w:val="24"/>
+          <w:lang w:val="en-US" w:eastAsia="zh-CN"/>
+        </w:rPr>
+      </w:pPr>
+    </w:p>
+    <w:p>
+      <w:pPr>
+        <w:jc w:val="left"/>
+        <w:rPr>
+          <w:rFonts w:hint="eastAsia" w:ascii="Arial" w:hAnsi="Arial" w:cs="Arial"/>
+          <w:b w:val="0"/>
+          <w:bCs w:val="0"/>
+          <w:sz w:val="24"/>
+          <w:szCs w:val="24"/>
+          <w:lang w:val="en-US" w:eastAsia="zh-CN"/>
+        </w:rPr>
+      </w:pPr>
+      <w:r>
+        <w:rPr>
+          <w:rFonts w:hint="eastAsia" w:ascii="Arial" w:hAnsi="Arial" w:cs="Arial"/>
+          <w:b w:val="0"/>
+          <w:bCs w:val="0"/>
+          <w:sz w:val="24"/>
+          <w:szCs w:val="24"/>
+          <w:lang w:val="en-US" w:eastAsia="zh-CN"/>
+        </w:rPr>
+        <w:t>4. Commit the files</w:t>
+      </w:r>
+    </w:p>
+    <w:p>
+      <w:pPr>
+        <w:jc w:val="left"/>
+        <w:rPr>
+          <w:rFonts w:hint="eastAsia" w:ascii="Arial" w:hAnsi="Arial" w:cs="Arial"/>
+          <w:b w:val="0"/>
+          <w:bCs w:val="0"/>
+          <w:sz w:val="24"/>
+          <w:szCs w:val="24"/>
+          <w:lang w:val="en-US" w:eastAsia="zh-CN"/>
+        </w:rPr>
+      </w:pPr>
+      <w:r>
+        <w:rPr>
+          <w:rFonts w:hint="eastAsia" w:ascii="Arial" w:hAnsi="Arial" w:cs="Arial"/>
+          <w:b w:val="0"/>
+          <w:bCs w:val="0"/>
+          <w:sz w:val="24"/>
+          <w:szCs w:val="24"/>
+          <w:lang w:val="en-US" w:eastAsia="zh-CN"/>
+        </w:rPr>
+        <w:t>The project files were committed with the following command:</w:t>
+      </w:r>
+    </w:p>
+    <w:p>
+      <w:pPr>
+        <w:jc w:val="left"/>
+        <w:rPr>
+          <w:rFonts w:hint="eastAsia" w:ascii="Arial" w:hAnsi="Arial" w:cs="Arial"/>
+          <w:b w:val="0"/>
+          <w:bCs w:val="0"/>
+          <w:sz w:val="24"/>
+          <w:szCs w:val="24"/>
+          <w:lang w:val="en-US" w:eastAsia="zh-CN"/>
+        </w:rPr>
+      </w:pPr>
+      <w:r>
+        <w:rPr>
+          <w:rFonts w:hint="eastAsia" w:ascii="Arial" w:hAnsi="Arial" w:cs="Arial"/>
+          <w:b w:val="0"/>
+          <w:bCs w:val="0"/>
+          <w:sz w:val="24"/>
+          <w:szCs w:val="24"/>
+          <w:lang w:val="en-US" w:eastAsia="zh-CN"/>
+        </w:rPr>
+        <w:t>"git commit -m "Initial seat booking system implementation"</w:t>
+      </w:r>
+    </w:p>
+    <w:p>
+      <w:pPr>
+        <w:jc w:val="left"/>
+        <w:rPr>
+          <w:rFonts w:hint="eastAsia" w:ascii="Arial" w:hAnsi="Arial" w:cs="Arial"/>
+          <w:b w:val="0"/>
+          <w:bCs w:val="0"/>
+          <w:sz w:val="24"/>
+          <w:szCs w:val="24"/>
+          <w:lang w:val="en-US" w:eastAsia="zh-CN"/>
+        </w:rPr>
+      </w:pPr>
+    </w:p>
+    <w:p>
+      <w:pPr>
+        <w:jc w:val="left"/>
+        <w:rPr>
+          <w:rFonts w:hint="eastAsia" w:ascii="Arial" w:hAnsi="Arial" w:cs="Arial"/>
+          <w:b w:val="0"/>
+          <w:bCs w:val="0"/>
+          <w:sz w:val="24"/>
+          <w:szCs w:val="24"/>
+          <w:lang w:val="en-US" w:eastAsia="zh-CN"/>
+        </w:rPr>
+      </w:pPr>
+      <w:r>
+        <w:rPr>
+          <w:rFonts w:hint="eastAsia" w:ascii="Arial" w:hAnsi="Arial" w:cs="Arial"/>
+          <w:b w:val="0"/>
+          <w:bCs w:val="0"/>
+          <w:sz w:val="24"/>
+          <w:szCs w:val="24"/>
+          <w:lang w:val="en-US" w:eastAsia="zh-CN"/>
+        </w:rPr>
+        <w:t>5. Connect to GitHub repository</w:t>
+      </w:r>
+    </w:p>
+    <w:p>
+      <w:pPr>
+        <w:jc w:val="left"/>
+        <w:rPr>
+          <w:rFonts w:hint="eastAsia" w:ascii="Arial" w:hAnsi="Arial" w:cs="Arial"/>
+          <w:b w:val="0"/>
+          <w:bCs w:val="0"/>
+          <w:sz w:val="24"/>
+          <w:szCs w:val="24"/>
+          <w:lang w:val="en-US" w:eastAsia="zh-CN"/>
+        </w:rPr>
+      </w:pPr>
+      <w:r>
+        <w:rPr>
+          <w:rFonts w:hint="eastAsia" w:ascii="Arial" w:hAnsi="Arial" w:cs="Arial"/>
+          <w:b w:val="0"/>
+          <w:bCs w:val="0"/>
+          <w:sz w:val="24"/>
+          <w:szCs w:val="24"/>
+          <w:lang w:val="en-US" w:eastAsia="zh-CN"/>
+        </w:rPr>
+        <w:t>The local repository was connected to the remote GitHub repository using:</w:t>
+      </w:r>
+    </w:p>
+    <w:p>
+      <w:pPr>
+        <w:jc w:val="left"/>
+        <w:rPr>
+          <w:rFonts w:hint="eastAsia" w:ascii="Arial" w:hAnsi="Arial" w:cs="Arial"/>
+          <w:b w:val="0"/>
+          <w:bCs w:val="0"/>
+          <w:sz w:val="24"/>
+          <w:szCs w:val="24"/>
+          <w:lang w:val="en-US" w:eastAsia="zh-CN"/>
+        </w:rPr>
+      </w:pPr>
+      <w:r>
+        <w:rPr>
+          <w:rFonts w:hint="eastAsia" w:ascii="Arial" w:hAnsi="Arial" w:cs="Arial"/>
+          <w:b w:val="0"/>
+          <w:bCs w:val="0"/>
+          <w:sz w:val="24"/>
+          <w:szCs w:val="24"/>
+          <w:lang w:val="en-US" w:eastAsia="zh-CN"/>
+        </w:rPr>
+        <w:t>"git remote add origin https://github.com/zeshuochen/apache-airlines-seat-booking"</w:t>
+      </w:r>
+    </w:p>
+    <w:p>
+      <w:pPr>
+        <w:jc w:val="left"/>
+        <w:rPr>
+          <w:rFonts w:hint="eastAsia" w:ascii="Arial" w:hAnsi="Arial" w:cs="Arial"/>
+          <w:b w:val="0"/>
+          <w:bCs w:val="0"/>
+          <w:sz w:val="24"/>
+          <w:szCs w:val="24"/>
+          <w:lang w:val="en-US" w:eastAsia="zh-CN"/>
+        </w:rPr>
+      </w:pPr>
+    </w:p>
+    <w:p>
+      <w:pPr>
+        <w:jc w:val="left"/>
+        <w:rPr>
+          <w:rFonts w:hint="eastAsia" w:ascii="Arial" w:hAnsi="Arial" w:cs="Arial"/>
+          <w:b w:val="0"/>
+          <w:bCs w:val="0"/>
+          <w:sz w:val="24"/>
+          <w:szCs w:val="24"/>
+          <w:lang w:val="en-US" w:eastAsia="zh-CN"/>
+        </w:rPr>
+      </w:pPr>
+      <w:r>
+        <w:rPr>
+          <w:rFonts w:hint="eastAsia" w:ascii="Arial" w:hAnsi="Arial" w:cs="Arial"/>
+          <w:b w:val="0"/>
+          <w:bCs w:val="0"/>
+          <w:sz w:val="24"/>
+          <w:szCs w:val="24"/>
+          <w:lang w:val="en-US" w:eastAsia="zh-CN"/>
+        </w:rPr>
+        <w:t>6. Push the code</w:t>
+      </w:r>
+    </w:p>
+    <w:p>
+      <w:pPr>
+        <w:jc w:val="left"/>
+        <w:rPr>
+          <w:rFonts w:hint="eastAsia" w:ascii="Arial" w:hAnsi="Arial" w:cs="Arial"/>
+          <w:b w:val="0"/>
+          <w:bCs w:val="0"/>
+          <w:sz w:val="24"/>
+          <w:szCs w:val="24"/>
+          <w:lang w:val="en-US" w:eastAsia="zh-CN"/>
+        </w:rPr>
+      </w:pPr>
+      <w:r>
+        <w:rPr>
+          <w:rFonts w:hint="eastAsia" w:ascii="Arial" w:hAnsi="Arial" w:cs="Arial"/>
+          <w:b w:val="0"/>
+          <w:bCs w:val="0"/>
+          <w:sz w:val="24"/>
+          <w:szCs w:val="24"/>
+          <w:lang w:val="en-US" w:eastAsia="zh-CN"/>
+        </w:rPr>
+        <w:t>Finally, the code was uploaded to GitHub using:</w:t>
+      </w:r>
+    </w:p>
+    <w:p>
+      <w:pPr>
+        <w:jc w:val="left"/>
+        <w:rPr>
+          <w:rFonts w:hint="eastAsia" w:ascii="Arial" w:hAnsi="Arial" w:cs="Arial"/>
+          <w:b w:val="0"/>
+          <w:bCs w:val="0"/>
+          <w:sz w:val="24"/>
+          <w:szCs w:val="24"/>
+          <w:lang w:val="en-US" w:eastAsia="zh-CN"/>
+        </w:rPr>
+      </w:pPr>
+      <w:r>
+        <w:rPr>
+          <w:rFonts w:hint="eastAsia" w:ascii="Arial" w:hAnsi="Arial" w:cs="Arial"/>
+          <w:b w:val="0"/>
+          <w:bCs w:val="0"/>
+          <w:sz w:val="24"/>
+          <w:szCs w:val="24"/>
+          <w:lang w:val="en-US" w:eastAsia="zh-CN"/>
+        </w:rPr>
+        <w:t>"git push -u origin main"</w:t>
+      </w:r>
+    </w:p>
+    <w:p>
+      <w:pPr>
+        <w:jc w:val="left"/>
+        <w:rPr>
+          <w:rFonts w:hint="eastAsia" w:ascii="Arial" w:hAnsi="Arial" w:cs="Arial"/>
+          <w:b w:val="0"/>
+          <w:bCs w:val="0"/>
+          <w:sz w:val="24"/>
+          <w:szCs w:val="24"/>
+          <w:lang w:val="en-US" w:eastAsia="zh-CN"/>
+        </w:rPr>
+      </w:pPr>
+    </w:p>
+    <w:p>
+      <w:pPr>
+        <w:jc w:val="left"/>
+        <w:rPr>
+          <w:rFonts w:hint="eastAsia" w:ascii="Arial" w:hAnsi="Arial" w:cs="Arial"/>
+          <w:b w:val="0"/>
+          <w:bCs w:val="0"/>
+          <w:sz w:val="24"/>
+          <w:szCs w:val="24"/>
+          <w:lang w:val="en-US" w:eastAsia="zh-CN"/>
+        </w:rPr>
+      </w:pPr>
+      <w:r>
+        <w:rPr>
+          <w:rFonts w:hint="eastAsia" w:ascii="Arial" w:hAnsi="Arial" w:cs="Arial"/>
+          <w:b w:val="0"/>
+          <w:bCs w:val="0"/>
+          <w:sz w:val="24"/>
+          <w:szCs w:val="24"/>
+          <w:lang w:val="en-US" w:eastAsia="zh-CN"/>
+        </w:rPr>
+        <w:t>Repository link:</w:t>
+      </w:r>
+    </w:p>
+    <w:p>
+      <w:pPr>
+        <w:jc w:val="left"/>
+        <w:rPr>
+          <w:rFonts w:hint="default" w:ascii="Arial" w:hAnsi="Arial" w:cs="Arial"/>
+          <w:b w:val="0"/>
+          <w:bCs w:val="0"/>
+          <w:sz w:val="24"/>
+          <w:szCs w:val="24"/>
+          <w:lang w:val="en-US" w:eastAsia="zh-CN"/>
+        </w:rPr>
+      </w:pPr>
+      <w:r>
+        <w:rPr>
+          <w:rFonts w:hint="eastAsia" w:ascii="Arial" w:hAnsi="Arial" w:cs="Arial"/>
+          <w:b w:val="0"/>
+          <w:bCs w:val="0"/>
+          <w:sz w:val="24"/>
+          <w:szCs w:val="24"/>
+          <w:lang w:val="en-US" w:eastAsia="zh-CN"/>
+        </w:rPr>
+        <w:fldChar w:fldCharType="begin"/>
+      </w:r>
+      <w:r>
+        <w:rPr>
+          <w:rFonts w:hint="eastAsia" w:ascii="Arial" w:hAnsi="Arial" w:cs="Arial"/>
+          <w:b w:val="0"/>
+          <w:bCs w:val="0"/>
+          <w:sz w:val="24"/>
+          <w:szCs w:val="24"/>
+          <w:lang w:val="en-US" w:eastAsia="zh-CN"/>
+        </w:rPr>
+        <w:instrText xml:space="preserve"> HYPERLINK "https://github.com/zeshuochen/apache-airlines-seat-booking" </w:instrText>
+      </w:r>
+      <w:r>
+        <w:rPr>
+          <w:rFonts w:hint="eastAsia" w:ascii="Arial" w:hAnsi="Arial" w:cs="Arial"/>
+          <w:b w:val="0"/>
+          <w:bCs w:val="0"/>
+          <w:sz w:val="24"/>
+          <w:szCs w:val="24"/>
+          <w:lang w:val="en-US" w:eastAsia="zh-CN"/>
+        </w:rPr>
+        <w:fldChar w:fldCharType="separate"/>
+      </w:r>
+      <w:r>
+        <w:rPr>
+          <w:rStyle w:val="7"/>
+          <w:rFonts w:hint="eastAsia" w:ascii="Arial" w:hAnsi="Arial" w:cs="Arial"/>
+          <w:b w:val="0"/>
+          <w:bCs w:val="0"/>
+          <w:sz w:val="24"/>
+          <w:szCs w:val="24"/>
+          <w:lang w:val="en-US" w:eastAsia="zh-CN"/>
+        </w:rPr>
+        <w:t>https://github.com/zeshuochen/apache-airlines-seat-booking</w:t>
+      </w:r>
+      <w:r>
+        <w:rPr>
+          <w:rFonts w:hint="eastAsia" w:ascii="Arial" w:hAnsi="Arial" w:cs="Arial"/>
+          <w:b w:val="0"/>
+          <w:bCs w:val="0"/>
+          <w:sz w:val="24"/>
+          <w:szCs w:val="24"/>
+          <w:lang w:val="en-US" w:eastAsia="zh-CN"/>
+        </w:rPr>
+        <w:fldChar w:fldCharType="end"/>
+      </w:r>
+    </w:p>
+    <w:p>
+      <w:pPr>
+        <w:jc w:val="left"/>
+        <w:rPr>
+          <w:rFonts w:hint="default" w:ascii="Arial" w:hAnsi="Arial" w:cs="Arial"/>
+          <w:b w:val="0"/>
+          <w:bCs w:val="0"/>
+          <w:sz w:val="24"/>
+          <w:szCs w:val="24"/>
+          <w:lang w:val="en-US" w:eastAsia="zh-CN"/>
+        </w:rPr>
+      </w:pPr>
+    </w:p>
+    <w:p>
+      <w:pPr>
+        <w:jc w:val="left"/>
+        <w:rPr>
+          <w:rFonts w:hint="default" w:ascii="Arial" w:hAnsi="Arial" w:cs="Arial"/>
+          <w:b w:val="0"/>
+          <w:bCs w:val="0"/>
+          <w:sz w:val="24"/>
+          <w:szCs w:val="24"/>
+          <w:lang w:val="en-US" w:eastAsia="zh-CN"/>
+        </w:rPr>
+      </w:pPr>
+    </w:p>
+    <w:p>
+      <w:pPr>
+        <w:jc w:val="left"/>
+        <w:rPr>
+          <w:rFonts w:hint="default" w:ascii="Arial" w:hAnsi="Arial" w:cs="Arial"/>
+          <w:b w:val="0"/>
+          <w:bCs w:val="0"/>
+          <w:sz w:val="24"/>
+          <w:szCs w:val="24"/>
+          <w:lang w:val="en-US" w:eastAsia="zh-CN"/>
+        </w:rPr>
+      </w:pPr>
+      <w:r>
+        <w:rPr>
+          <w:rFonts w:hint="default" w:ascii="Arial" w:hAnsi="Arial" w:cs="Arial"/>
+          <w:b w:val="0"/>
+          <w:bCs w:val="0"/>
+          <w:sz w:val="24"/>
+          <w:szCs w:val="24"/>
+          <w:lang w:val="en-US" w:eastAsia="zh-CN"/>
+        </w:rPr>
+        <w:t>B.1 Random Booking Reference Algorithm</w:t>
+      </w:r>
+    </w:p>
+    <w:p>
+      <w:pPr>
+        <w:jc w:val="left"/>
+        <w:rPr>
+          <w:rFonts w:hint="default" w:ascii="Arial" w:hAnsi="Arial" w:cs="Arial"/>
+          <w:b w:val="0"/>
+          <w:bCs w:val="0"/>
+          <w:sz w:val="24"/>
+          <w:szCs w:val="24"/>
+          <w:lang w:val="en-US" w:eastAsia="zh-CN"/>
+        </w:rPr>
+      </w:pPr>
+      <w:r>
+        <w:rPr>
+          <w:rFonts w:hint="default" w:ascii="Arial" w:hAnsi="Arial" w:cs="Arial"/>
+          <w:b w:val="0"/>
+          <w:bCs w:val="0"/>
+          <w:sz w:val="24"/>
+          <w:szCs w:val="24"/>
+          <w:lang w:val="en-US" w:eastAsia="zh-CN"/>
+        </w:rPr>
+        <w:t>To satisfy the Apache Airlines requirement for a unique booking reference, a booking reference generation algorithm was developed. The algorithm produces a random booking reference consisting of exactly eight alphanumeric characters. The characters are selected from uppercase letters A–Z and digits 0–9, which provides a large number of possible combinations and reduces the chance of duplication.</w:t>
+      </w:r>
+    </w:p>
+    <w:p>
+      <w:pPr>
+        <w:jc w:val="left"/>
+        <w:rPr>
+          <w:rFonts w:hint="default" w:ascii="Arial" w:hAnsi="Arial" w:cs="Arial"/>
+          <w:b w:val="0"/>
+          <w:bCs w:val="0"/>
+          <w:sz w:val="24"/>
+          <w:szCs w:val="24"/>
+          <w:lang w:val="en-US" w:eastAsia="zh-CN"/>
+        </w:rPr>
+      </w:pPr>
+    </w:p>
+    <w:p>
+      <w:pPr>
+        <w:jc w:val="left"/>
+        <w:rPr>
+          <w:rFonts w:hint="default" w:ascii="Arial" w:hAnsi="Arial" w:cs="Arial"/>
+          <w:b w:val="0"/>
+          <w:bCs w:val="0"/>
+          <w:sz w:val="24"/>
+          <w:szCs w:val="24"/>
+          <w:lang w:val="en-US" w:eastAsia="zh-CN"/>
+        </w:rPr>
+      </w:pPr>
+      <w:r>
+        <w:rPr>
+          <w:rFonts w:hint="default" w:ascii="Arial" w:hAnsi="Arial" w:cs="Arial"/>
+          <w:b w:val="0"/>
+          <w:bCs w:val="0"/>
+          <w:sz w:val="24"/>
+          <w:szCs w:val="24"/>
+          <w:lang w:val="en-US" w:eastAsia="zh-CN"/>
+        </w:rPr>
+        <w:t>The implementation logic of the algorithm is as follows:</w:t>
+      </w:r>
+    </w:p>
+    <w:p>
+      <w:pPr>
+        <w:jc w:val="left"/>
+        <w:rPr>
+          <w:rFonts w:hint="default" w:ascii="Arial" w:hAnsi="Arial" w:cs="Arial"/>
+          <w:b w:val="0"/>
+          <w:bCs w:val="0"/>
+          <w:sz w:val="24"/>
+          <w:szCs w:val="24"/>
+          <w:lang w:val="en-US" w:eastAsia="zh-CN"/>
+        </w:rPr>
+      </w:pPr>
+    </w:p>
+    <w:p>
+      <w:pPr>
+        <w:jc w:val="left"/>
+        <w:rPr>
+          <w:rFonts w:hint="default" w:ascii="Arial" w:hAnsi="Arial" w:cs="Arial"/>
+          <w:b w:val="0"/>
+          <w:bCs w:val="0"/>
+          <w:sz w:val="24"/>
+          <w:szCs w:val="24"/>
+          <w:lang w:val="en-US" w:eastAsia="zh-CN"/>
+        </w:rPr>
+      </w:pPr>
+      <w:r>
+        <w:rPr>
+          <w:rFonts w:hint="default" w:ascii="Arial" w:hAnsi="Arial" w:cs="Arial"/>
+          <w:b w:val="0"/>
+          <w:bCs w:val="0"/>
+          <w:sz w:val="24"/>
+          <w:szCs w:val="24"/>
+          <w:lang w:val="en-US" w:eastAsia="zh-CN"/>
+        </w:rPr>
+        <w:t>1. A string containing all valid characters is prepared using uppercase letters and digits.</w:t>
+      </w:r>
+    </w:p>
+    <w:p>
+      <w:pPr>
+        <w:jc w:val="left"/>
+        <w:rPr>
+          <w:rFonts w:hint="default" w:ascii="Arial" w:hAnsi="Arial" w:cs="Arial"/>
+          <w:b w:val="0"/>
+          <w:bCs w:val="0"/>
+          <w:sz w:val="24"/>
+          <w:szCs w:val="24"/>
+          <w:lang w:val="en-US" w:eastAsia="zh-CN"/>
+        </w:rPr>
+      </w:pPr>
+      <w:r>
+        <w:rPr>
+          <w:rFonts w:hint="default" w:ascii="Arial" w:hAnsi="Arial" w:cs="Arial"/>
+          <w:b w:val="0"/>
+          <w:bCs w:val="0"/>
+          <w:sz w:val="24"/>
+          <w:szCs w:val="24"/>
+          <w:lang w:val="en-US" w:eastAsia="zh-CN"/>
+        </w:rPr>
+        <w:t>2. The program randomly selects eight characters from this set.</w:t>
+      </w:r>
+    </w:p>
+    <w:p>
+      <w:pPr>
+        <w:jc w:val="left"/>
+        <w:rPr>
+          <w:rFonts w:hint="default" w:ascii="Arial" w:hAnsi="Arial" w:cs="Arial"/>
+          <w:b w:val="0"/>
+          <w:bCs w:val="0"/>
+          <w:sz w:val="24"/>
+          <w:szCs w:val="24"/>
+          <w:lang w:val="en-US" w:eastAsia="zh-CN"/>
+        </w:rPr>
+      </w:pPr>
+      <w:r>
+        <w:rPr>
+          <w:rFonts w:hint="default" w:ascii="Arial" w:hAnsi="Arial" w:cs="Arial"/>
+          <w:b w:val="0"/>
+          <w:bCs w:val="0"/>
+          <w:sz w:val="24"/>
+          <w:szCs w:val="24"/>
+          <w:lang w:val="en-US" w:eastAsia="zh-CN"/>
+        </w:rPr>
+        <w:t>3. The selected characters are joined together to form a booking reference.</w:t>
+      </w:r>
+    </w:p>
+    <w:p>
+      <w:pPr>
+        <w:jc w:val="left"/>
+        <w:rPr>
+          <w:rFonts w:hint="default" w:ascii="Arial" w:hAnsi="Arial" w:cs="Arial"/>
+          <w:b w:val="0"/>
+          <w:bCs w:val="0"/>
+          <w:sz w:val="24"/>
+          <w:szCs w:val="24"/>
+          <w:lang w:val="en-US" w:eastAsia="zh-CN"/>
+        </w:rPr>
+      </w:pPr>
+      <w:r>
+        <w:rPr>
+          <w:rFonts w:hint="default" w:ascii="Arial" w:hAnsi="Arial" w:cs="Arial"/>
+          <w:b w:val="0"/>
+          <w:bCs w:val="0"/>
+          <w:sz w:val="24"/>
+          <w:szCs w:val="24"/>
+          <w:lang w:val="en-US" w:eastAsia="zh-CN"/>
+        </w:rPr>
+        <w:t>4. The program checks the database table to determine whether the generated booking reference already exists.</w:t>
+      </w:r>
+    </w:p>
+    <w:p>
+      <w:pPr>
+        <w:jc w:val="left"/>
+        <w:rPr>
+          <w:rFonts w:hint="default" w:ascii="Arial" w:hAnsi="Arial" w:cs="Arial"/>
+          <w:b w:val="0"/>
+          <w:bCs w:val="0"/>
+          <w:sz w:val="24"/>
+          <w:szCs w:val="24"/>
+          <w:lang w:val="en-US" w:eastAsia="zh-CN"/>
+        </w:rPr>
+      </w:pPr>
+      <w:r>
+        <w:rPr>
+          <w:rFonts w:hint="default" w:ascii="Arial" w:hAnsi="Arial" w:cs="Arial"/>
+          <w:b w:val="0"/>
+          <w:bCs w:val="0"/>
+          <w:sz w:val="24"/>
+          <w:szCs w:val="24"/>
+          <w:lang w:val="en-US" w:eastAsia="zh-CN"/>
+        </w:rPr>
+        <w:t>5. If the reference already exists, the algorithm repeats the generation process.If the reference does not exist, it is accepted as a valid unique booking reference.</w:t>
+      </w:r>
+    </w:p>
+    <w:p>
+      <w:pPr>
+        <w:jc w:val="left"/>
+        <w:rPr>
+          <w:rFonts w:hint="default" w:ascii="Arial" w:hAnsi="Arial" w:cs="Arial"/>
+          <w:b w:val="0"/>
+          <w:bCs w:val="0"/>
+          <w:sz w:val="24"/>
+          <w:szCs w:val="24"/>
+          <w:lang w:val="en-US" w:eastAsia="zh-CN"/>
+        </w:rPr>
+      </w:pPr>
+    </w:p>
+    <w:p>
+      <w:pPr>
+        <w:jc w:val="left"/>
+        <w:rPr>
+          <w:rFonts w:hint="default" w:ascii="Arial" w:hAnsi="Arial" w:cs="Arial"/>
+          <w:b w:val="0"/>
+          <w:bCs w:val="0"/>
+          <w:sz w:val="24"/>
+          <w:szCs w:val="24"/>
+          <w:lang w:val="en-US" w:eastAsia="zh-CN"/>
+        </w:rPr>
+      </w:pPr>
+      <w:r>
+        <w:rPr>
+          <w:rFonts w:hint="default" w:ascii="Arial" w:hAnsi="Arial" w:cs="Arial"/>
+          <w:b w:val="0"/>
+          <w:bCs w:val="0"/>
+          <w:sz w:val="24"/>
+          <w:szCs w:val="24"/>
+          <w:lang w:val="en-US" w:eastAsia="zh-CN"/>
+        </w:rPr>
+        <w:t>This design guarantees uniqueness by validating every generated reference against the database before it is assigned to a passenger. The use of a loop ensures that the algorithm continues running until a unique value is found. The method was also commented in the source code to explain its purpose and logic. The implemented Python method is generate_booking_reference(), which uses random.choices() to produce the code and an SQL SELECT query to test uniqueness.</w:t>
+      </w:r>
+    </w:p>
+    <w:p>
+      <w:pPr>
+        <w:jc w:val="left"/>
+        <w:rPr>
+          <w:rFonts w:hint="default" w:ascii="Arial" w:hAnsi="Arial" w:cs="Arial"/>
+          <w:b w:val="0"/>
+          <w:bCs w:val="0"/>
+          <w:sz w:val="24"/>
+          <w:szCs w:val="24"/>
+          <w:lang w:val="en-US" w:eastAsia="zh-CN"/>
+        </w:rPr>
+      </w:pPr>
+    </w:p>
+    <w:p>
+      <w:pPr>
+        <w:jc w:val="left"/>
+        <w:rPr>
+          <w:rFonts w:hint="default" w:ascii="Arial" w:hAnsi="Arial" w:cs="Arial"/>
+          <w:b w:val="0"/>
+          <w:bCs w:val="0"/>
+          <w:sz w:val="24"/>
+          <w:szCs w:val="24"/>
+          <w:lang w:val="en-US" w:eastAsia="zh-CN"/>
+        </w:rPr>
+      </w:pPr>
+    </w:p>
+    <w:p>
+      <w:pPr>
+        <w:jc w:val="left"/>
+        <w:rPr>
+          <w:rFonts w:hint="default" w:ascii="Arial" w:hAnsi="Arial" w:cs="Arial"/>
+          <w:b w:val="0"/>
+          <w:bCs w:val="0"/>
+          <w:sz w:val="24"/>
+          <w:szCs w:val="24"/>
+          <w:lang w:val="en-US" w:eastAsia="zh-CN"/>
+        </w:rPr>
+      </w:pPr>
+      <w:r>
+        <w:rPr>
+          <w:rFonts w:hint="default" w:ascii="Arial" w:hAnsi="Arial" w:cs="Arial"/>
+          <w:b w:val="0"/>
+          <w:bCs w:val="0"/>
+          <w:sz w:val="24"/>
+          <w:szCs w:val="24"/>
+          <w:lang w:val="en-US" w:eastAsia="zh-CN"/>
+        </w:rPr>
+        <w:t>B.2 Refactoring Part A to Use Database Storage</w:t>
+      </w:r>
+    </w:p>
+    <w:p>
+      <w:pPr>
+        <w:jc w:val="left"/>
+        <w:rPr>
+          <w:rFonts w:hint="default" w:ascii="Arial" w:hAnsi="Arial" w:cs="Arial"/>
+          <w:b w:val="0"/>
+          <w:bCs w:val="0"/>
+          <w:sz w:val="24"/>
+          <w:szCs w:val="24"/>
+          <w:lang w:val="en-US" w:eastAsia="zh-CN"/>
+        </w:rPr>
+      </w:pPr>
+      <w:r>
+        <w:rPr>
+          <w:rFonts w:hint="default" w:ascii="Arial" w:hAnsi="Arial" w:cs="Arial"/>
+          <w:b w:val="0"/>
+          <w:bCs w:val="0"/>
+          <w:sz w:val="24"/>
+          <w:szCs w:val="24"/>
+          <w:lang w:val="en-US" w:eastAsia="zh-CN"/>
+        </w:rPr>
+        <w:t>The functionalities from Part A were refactored so that the system could support bookings with database. In Part A, a booked seat was represented using the letter "R". In Part B, this logic was extended so that the seat now stores the generated booking reference instead of a marker "R". At the same time, traveller information is stored in an SQLite database table. This makes the system more secure and usable.</w:t>
+      </w:r>
+    </w:p>
+    <w:p>
+      <w:pPr>
+        <w:jc w:val="left"/>
+        <w:rPr>
+          <w:rFonts w:hint="default" w:ascii="Arial" w:hAnsi="Arial" w:cs="Arial"/>
+          <w:b w:val="0"/>
+          <w:bCs w:val="0"/>
+          <w:sz w:val="24"/>
+          <w:szCs w:val="24"/>
+          <w:lang w:val="en-US" w:eastAsia="zh-CN"/>
+        </w:rPr>
+      </w:pPr>
+    </w:p>
+    <w:p>
+      <w:pPr>
+        <w:jc w:val="left"/>
+        <w:rPr>
+          <w:rFonts w:hint="default" w:ascii="Arial" w:hAnsi="Arial" w:cs="Arial"/>
+          <w:b w:val="0"/>
+          <w:bCs w:val="0"/>
+          <w:sz w:val="24"/>
+          <w:szCs w:val="24"/>
+          <w:lang w:val="en-US" w:eastAsia="zh-CN"/>
+        </w:rPr>
+      </w:pPr>
+      <w:r>
+        <w:rPr>
+          <w:rFonts w:hint="default" w:ascii="Arial" w:hAnsi="Arial" w:cs="Arial"/>
+          <w:b w:val="0"/>
+          <w:bCs w:val="0"/>
+          <w:sz w:val="24"/>
+          <w:szCs w:val="24"/>
+          <w:lang w:val="en-US" w:eastAsia="zh-CN"/>
+        </w:rPr>
+        <w:t xml:space="preserve">Furthermore, when a user books a seat, the system first checks that the seat is valid, free, and not part of a storage area. The program then asks the user to enter the passenger’s passport number, first name, and last name. After this, the system generates a unique booking reference and stores it in the seat data structure. The passenger information and seat number are then inserted into the bookings database table. The table stores the booking reference, passport number, first name, last name, seat raw and seat coloum. </w:t>
+      </w:r>
+    </w:p>
+    <w:p>
+      <w:pPr>
+        <w:jc w:val="left"/>
+        <w:rPr>
+          <w:rFonts w:hint="default" w:ascii="Arial" w:hAnsi="Arial" w:cs="Arial"/>
+          <w:b w:val="0"/>
+          <w:bCs w:val="0"/>
+          <w:sz w:val="24"/>
+          <w:szCs w:val="24"/>
+          <w:lang w:val="en-US" w:eastAsia="zh-CN"/>
+        </w:rPr>
+      </w:pPr>
+    </w:p>
+    <w:p>
+      <w:pPr>
+        <w:jc w:val="left"/>
+        <w:rPr>
+          <w:rFonts w:hint="default" w:ascii="Arial" w:hAnsi="Arial" w:cs="Arial"/>
+          <w:b w:val="0"/>
+          <w:bCs w:val="0"/>
+          <w:sz w:val="24"/>
+          <w:szCs w:val="24"/>
+          <w:lang w:val="en-US" w:eastAsia="zh-CN"/>
+        </w:rPr>
+      </w:pPr>
+      <w:r>
+        <w:rPr>
+          <w:rFonts w:hint="default" w:ascii="Arial" w:hAnsi="Arial" w:cs="Arial"/>
+          <w:b w:val="0"/>
+          <w:bCs w:val="0"/>
+          <w:sz w:val="24"/>
+          <w:szCs w:val="24"/>
+          <w:lang w:val="en-US" w:eastAsia="zh-CN"/>
+        </w:rPr>
+        <w:t>When a seat is freed, the system reads the booking reference stored in that seat, deletes the corresponding record from the database, and changes the seat status back to “F”. This ensures that the booking reference has reusability.  Therefore, the refactoring satisfies the requirement that booking details must be stored when a booking is made, and removed when a seat is freeed.</w:t>
+      </w:r>
+    </w:p>
+    <w:p>
+      <w:pPr>
+        <w:jc w:val="left"/>
+        <w:rPr>
+          <w:rFonts w:hint="default" w:ascii="Arial" w:hAnsi="Arial" w:cs="Arial"/>
+          <w:b w:val="0"/>
+          <w:bCs w:val="0"/>
+          <w:sz w:val="24"/>
+          <w:szCs w:val="24"/>
+          <w:lang w:val="en-US" w:eastAsia="zh-CN"/>
+        </w:rPr>
+      </w:pPr>
+    </w:p>
+    <w:p>
+      <w:pPr>
+        <w:jc w:val="left"/>
+        <w:rPr>
+          <w:rFonts w:hint="default" w:ascii="Arial" w:hAnsi="Arial" w:cs="Arial"/>
+          <w:b w:val="0"/>
+          <w:bCs w:val="0"/>
+          <w:sz w:val="24"/>
+          <w:szCs w:val="24"/>
+          <w:lang w:val="en-US" w:eastAsia="zh-CN"/>
+        </w:rPr>
+      </w:pPr>
+      <w:r>
+        <w:rPr>
+          <w:rFonts w:hint="default" w:ascii="Arial" w:hAnsi="Arial" w:cs="Arial"/>
+          <w:b w:val="0"/>
+          <w:bCs w:val="0"/>
+          <w:sz w:val="24"/>
+          <w:szCs w:val="24"/>
+          <w:lang w:val="en-US" w:eastAsia="zh-CN"/>
+        </w:rPr>
+        <w:t>The SQLite database was chosen because it is lightweight, does not require a separate server, and integrates easily with Python through the sqlite3 module. The database file is stored in the same directory as the system code, which makes the project easier to manage.</w:t>
+      </w:r>
+    </w:p>
+    <w:p>
+      <w:pPr>
+        <w:jc w:val="left"/>
+        <w:rPr>
+          <w:rFonts w:hint="default" w:ascii="Arial" w:hAnsi="Arial" w:cs="Arial"/>
+          <w:b w:val="0"/>
+          <w:bCs w:val="0"/>
+          <w:sz w:val="24"/>
+          <w:szCs w:val="24"/>
+          <w:lang w:val="en-US" w:eastAsia="zh-CN"/>
+        </w:rPr>
+      </w:pPr>
+    </w:p>
+    <w:p>
+      <w:pPr>
+        <w:jc w:val="left"/>
+        <w:rPr>
+          <w:rFonts w:hint="eastAsia" w:ascii="Arial" w:hAnsi="Arial" w:cs="Arial"/>
+          <w:b w:val="0"/>
+          <w:bCs w:val="0"/>
+          <w:sz w:val="24"/>
+          <w:szCs w:val="24"/>
+          <w:lang w:val="en-US" w:eastAsia="zh-CN"/>
+        </w:rPr>
+      </w:pPr>
       <w:bookmarkStart w:id="0" w:name="_GoBack"/>
-      <w:bookmarkEnd w:id="0"/>
-    </w:p>
-    <w:p>
-      <w:pPr>
-        <w:jc w:val="left"/>
-        <w:rPr>
-          <w:rFonts w:hint="default" w:ascii="Arial" w:hAnsi="Arial" w:cs="Arial"/>
-          <w:b w:val="0"/>
-          <w:bCs w:val="0"/>
-          <w:sz w:val="24"/>
-          <w:szCs w:val="24"/>
-          <w:lang w:val="en-US" w:eastAsia="zh-CN"/>
-        </w:rPr>
-      </w:pPr>
-      <w:r>
-        <w:rPr>
-          <w:rFonts w:hint="default" w:ascii="Arial" w:hAnsi="Arial" w:cs="Arial"/>
-          <w:b w:val="0"/>
-          <w:bCs w:val="0"/>
-          <w:sz w:val="24"/>
-          <w:szCs w:val="24"/>
-          <w:lang w:val="en-US" w:eastAsia="zh-CN"/>
-        </w:rPr>
-        <w:t>A.5 Additional functionality implementation</w:t>
-      </w:r>
-    </w:p>
-    <w:p>
-      <w:pPr>
-        <w:jc w:val="left"/>
-        <w:rPr>
-          <w:rFonts w:hint="default" w:ascii="Arial" w:hAnsi="Arial" w:cs="Arial"/>
-          <w:b w:val="0"/>
-          <w:bCs w:val="0"/>
-          <w:sz w:val="24"/>
-          <w:szCs w:val="24"/>
-          <w:lang w:val="en-US" w:eastAsia="zh-CN"/>
-        </w:rPr>
-      </w:pPr>
-      <w:r>
-        <w:rPr>
-          <w:rFonts w:hint="default" w:ascii="Arial" w:hAnsi="Arial" w:cs="Arial"/>
-          <w:b w:val="0"/>
-          <w:bCs w:val="0"/>
-          <w:sz w:val="24"/>
-          <w:szCs w:val="24"/>
-          <w:lang w:val="en-US" w:eastAsia="zh-CN"/>
-        </w:rPr>
-        <w:t>In addition to the required functionalities, an extra feature called “” was implemented.</w:t>
-      </w:r>
-    </w:p>
-    <w:p>
-      <w:pPr>
-        <w:jc w:val="left"/>
-        <w:rPr>
-          <w:rFonts w:hint="default" w:ascii="Arial" w:hAnsi="Arial" w:cs="Arial"/>
-          <w:b w:val="0"/>
-          <w:bCs w:val="0"/>
-          <w:sz w:val="24"/>
-          <w:szCs w:val="24"/>
-          <w:lang w:val="en-US" w:eastAsia="zh-CN"/>
-        </w:rPr>
-      </w:pPr>
-    </w:p>
-    <w:p>
-      <w:pPr>
-        <w:jc w:val="left"/>
-        <w:rPr>
-          <w:rFonts w:hint="default" w:ascii="Arial" w:hAnsi="Arial" w:cs="Arial"/>
-          <w:b w:val="0"/>
-          <w:bCs w:val="0"/>
-          <w:sz w:val="24"/>
-          <w:szCs w:val="24"/>
-          <w:lang w:val="en-US" w:eastAsia="zh-CN"/>
-        </w:rPr>
-      </w:pPr>
-      <w:r>
-        <w:rPr>
-          <w:rFonts w:hint="default" w:ascii="Arial" w:hAnsi="Arial" w:cs="Arial"/>
-          <w:b w:val="0"/>
-          <w:bCs w:val="0"/>
-          <w:sz w:val="24"/>
-          <w:szCs w:val="24"/>
-          <w:lang w:val="en-US" w:eastAsia="zh-CN"/>
-        </w:rPr>
-        <w:t>This functionality allows a user to reserve more than one seat in a single operation. This is a common feature in airline booking systems because passengers often travel with friends, family members, or in small groups.</w:t>
-      </w:r>
-    </w:p>
-    <w:p>
-      <w:pPr>
-        <w:jc w:val="left"/>
-        <w:rPr>
-          <w:rFonts w:hint="default" w:ascii="Arial" w:hAnsi="Arial" w:cs="Arial"/>
-          <w:b w:val="0"/>
-          <w:bCs w:val="0"/>
-          <w:sz w:val="24"/>
-          <w:szCs w:val="24"/>
-          <w:lang w:val="en-US" w:eastAsia="zh-CN"/>
-        </w:rPr>
-      </w:pPr>
-    </w:p>
-    <w:p>
-      <w:pPr>
-        <w:jc w:val="left"/>
-        <w:rPr>
-          <w:rFonts w:hint="default" w:ascii="Arial" w:hAnsi="Arial" w:cs="Arial"/>
-          <w:b w:val="0"/>
-          <w:bCs w:val="0"/>
-          <w:sz w:val="24"/>
-          <w:szCs w:val="24"/>
-          <w:lang w:val="en-US" w:eastAsia="zh-CN"/>
-        </w:rPr>
-      </w:pPr>
-      <w:r>
-        <w:rPr>
-          <w:rFonts w:hint="default" w:ascii="Arial" w:hAnsi="Arial" w:cs="Arial"/>
-          <w:b w:val="0"/>
-          <w:bCs w:val="0"/>
-          <w:sz w:val="24"/>
-          <w:szCs w:val="24"/>
-          <w:lang w:val="en-US" w:eastAsia="zh-CN"/>
-        </w:rPr>
-        <w:t>The purpose of this feature is to improve convenience and reduce repetition. Without this function, a user would need to repeat the booking process several times when reserving seats for a group. By allowing multiple seat selections in one process, the system becomes more efficient and user-friendly.</w:t>
-      </w:r>
-    </w:p>
-    <w:p>
-      <w:pPr>
-        <w:jc w:val="left"/>
-        <w:rPr>
-          <w:rFonts w:hint="default" w:ascii="Arial" w:hAnsi="Arial" w:cs="Arial"/>
-          <w:b w:val="0"/>
-          <w:bCs w:val="0"/>
-          <w:sz w:val="24"/>
-          <w:szCs w:val="24"/>
-          <w:lang w:val="en-US" w:eastAsia="zh-CN"/>
-        </w:rPr>
-      </w:pPr>
-    </w:p>
-    <w:p>
-      <w:pPr>
-        <w:jc w:val="left"/>
-        <w:rPr>
-          <w:rFonts w:hint="default" w:ascii="Arial" w:hAnsi="Arial" w:cs="Arial"/>
-          <w:b w:val="0"/>
-          <w:bCs w:val="0"/>
-          <w:sz w:val="24"/>
-          <w:szCs w:val="24"/>
-          <w:lang w:val="en-US" w:eastAsia="zh-CN"/>
-        </w:rPr>
-      </w:pPr>
-      <w:r>
-        <w:rPr>
-          <w:rFonts w:hint="default" w:ascii="Arial" w:hAnsi="Arial" w:cs="Arial"/>
-          <w:b w:val="0"/>
-          <w:bCs w:val="0"/>
-          <w:sz w:val="24"/>
-          <w:szCs w:val="24"/>
-          <w:lang w:val="en-US" w:eastAsia="zh-CN"/>
-        </w:rPr>
-        <w:t>Implementation Logic:</w:t>
-      </w:r>
-    </w:p>
-    <w:p>
-      <w:pPr>
-        <w:jc w:val="left"/>
-        <w:rPr>
-          <w:rFonts w:hint="default" w:ascii="Arial" w:hAnsi="Arial" w:cs="Arial"/>
-          <w:b w:val="0"/>
-          <w:bCs w:val="0"/>
-          <w:sz w:val="24"/>
-          <w:szCs w:val="24"/>
-          <w:lang w:val="en-US" w:eastAsia="zh-CN"/>
-        </w:rPr>
-      </w:pPr>
-    </w:p>
-    <w:p>
-      <w:pPr>
-        <w:jc w:val="left"/>
-        <w:rPr>
-          <w:rFonts w:hint="default" w:ascii="Arial" w:hAnsi="Arial" w:cs="Arial"/>
-          <w:b w:val="0"/>
-          <w:bCs w:val="0"/>
-          <w:sz w:val="24"/>
-          <w:szCs w:val="24"/>
-          <w:lang w:val="en-US" w:eastAsia="zh-CN"/>
-        </w:rPr>
-      </w:pPr>
-      <w:r>
-        <w:rPr>
-          <w:rFonts w:hint="default" w:ascii="Arial" w:hAnsi="Arial" w:cs="Arial"/>
-          <w:b w:val="0"/>
-          <w:bCs w:val="0"/>
-          <w:sz w:val="24"/>
-          <w:szCs w:val="24"/>
-          <w:lang w:val="en-US" w:eastAsia="zh-CN"/>
-        </w:rPr>
-        <w:t>The functionality works as follows:</w:t>
-      </w:r>
-    </w:p>
-    <w:p>
-      <w:pPr>
-        <w:jc w:val="left"/>
-        <w:rPr>
-          <w:rFonts w:hint="default" w:ascii="Arial" w:hAnsi="Arial" w:cs="Arial"/>
-          <w:b w:val="0"/>
-          <w:bCs w:val="0"/>
-          <w:sz w:val="24"/>
-          <w:szCs w:val="24"/>
-          <w:lang w:val="en-US" w:eastAsia="zh-CN"/>
-        </w:rPr>
-      </w:pPr>
-      <w:r>
-        <w:rPr>
-          <w:rFonts w:hint="default" w:ascii="Arial" w:hAnsi="Arial" w:cs="Arial"/>
-          <w:b w:val="0"/>
-          <w:bCs w:val="0"/>
-          <w:sz w:val="24"/>
-          <w:szCs w:val="24"/>
-          <w:lang w:val="en-US" w:eastAsia="zh-CN"/>
-        </w:rPr>
-        <w:t>1. The user selects the Book Multiple Seats option from the menu.</w:t>
-      </w:r>
-    </w:p>
-    <w:p>
-      <w:pPr>
-        <w:jc w:val="left"/>
-        <w:rPr>
-          <w:rFonts w:hint="default" w:ascii="Arial" w:hAnsi="Arial" w:cs="Arial"/>
-          <w:b w:val="0"/>
-          <w:bCs w:val="0"/>
-          <w:sz w:val="24"/>
-          <w:szCs w:val="24"/>
-          <w:lang w:val="en-US" w:eastAsia="zh-CN"/>
-        </w:rPr>
-      </w:pPr>
-      <w:r>
-        <w:rPr>
-          <w:rFonts w:hint="default" w:ascii="Arial" w:hAnsi="Arial" w:cs="Arial"/>
-          <w:b w:val="0"/>
-          <w:bCs w:val="0"/>
-          <w:sz w:val="24"/>
-          <w:szCs w:val="24"/>
-          <w:lang w:val="en-US" w:eastAsia="zh-CN"/>
-        </w:rPr>
-        <w:t>2. The system asks the user how many seats they want to book.</w:t>
-      </w:r>
-    </w:p>
-    <w:p>
-      <w:pPr>
-        <w:jc w:val="left"/>
-        <w:rPr>
-          <w:rFonts w:hint="default" w:ascii="Arial" w:hAnsi="Arial" w:cs="Arial"/>
-          <w:b w:val="0"/>
-          <w:bCs w:val="0"/>
-          <w:sz w:val="24"/>
-          <w:szCs w:val="24"/>
-          <w:lang w:val="en-US" w:eastAsia="zh-CN"/>
-        </w:rPr>
-      </w:pPr>
-      <w:r>
-        <w:rPr>
-          <w:rFonts w:hint="default" w:ascii="Arial" w:hAnsi="Arial" w:cs="Arial"/>
-          <w:b w:val="0"/>
-          <w:bCs w:val="0"/>
-          <w:sz w:val="24"/>
-          <w:szCs w:val="24"/>
-          <w:lang w:val="en-US" w:eastAsia="zh-CN"/>
-        </w:rPr>
-        <w:t>3. The user enters the required seat numbers one by one.</w:t>
-      </w:r>
-    </w:p>
-    <w:p>
-      <w:pPr>
-        <w:jc w:val="left"/>
-        <w:rPr>
-          <w:rFonts w:hint="default" w:ascii="Arial" w:hAnsi="Arial" w:cs="Arial"/>
-          <w:b w:val="0"/>
-          <w:bCs w:val="0"/>
-          <w:sz w:val="24"/>
-          <w:szCs w:val="24"/>
-          <w:lang w:val="en-US" w:eastAsia="zh-CN"/>
-        </w:rPr>
-      </w:pPr>
-      <w:r>
-        <w:rPr>
-          <w:rFonts w:hint="default" w:ascii="Arial" w:hAnsi="Arial" w:cs="Arial"/>
-          <w:b w:val="0"/>
-          <w:bCs w:val="0"/>
-          <w:sz w:val="24"/>
-          <w:szCs w:val="24"/>
-          <w:lang w:val="en-US" w:eastAsia="zh-CN"/>
-        </w:rPr>
-        <w:t>4. For each seat entered, the system checks whether the seat code is valid.</w:t>
-      </w:r>
-    </w:p>
-    <w:p>
-      <w:pPr>
-        <w:jc w:val="left"/>
-        <w:rPr>
-          <w:rFonts w:hint="default" w:ascii="Arial" w:hAnsi="Arial" w:cs="Arial"/>
-          <w:b w:val="0"/>
-          <w:bCs w:val="0"/>
-          <w:sz w:val="24"/>
-          <w:szCs w:val="24"/>
-          <w:lang w:val="en-US" w:eastAsia="zh-CN"/>
-        </w:rPr>
-      </w:pPr>
-      <w:r>
-        <w:rPr>
-          <w:rFonts w:hint="default" w:ascii="Arial" w:hAnsi="Arial" w:cs="Arial"/>
-          <w:b w:val="0"/>
-          <w:bCs w:val="0"/>
-          <w:sz w:val="24"/>
-          <w:szCs w:val="24"/>
-          <w:lang w:val="en-US" w:eastAsia="zh-CN"/>
-        </w:rPr>
-        <w:t>5. The system then checks whether the selected position is a normal seat rather than an aisle (“X”) or storage area (“S”).</w:t>
-      </w:r>
-    </w:p>
-    <w:p>
-      <w:pPr>
-        <w:jc w:val="left"/>
-        <w:rPr>
-          <w:rFonts w:hint="default" w:ascii="Arial" w:hAnsi="Arial" w:cs="Arial"/>
-          <w:b w:val="0"/>
-          <w:bCs w:val="0"/>
-          <w:sz w:val="24"/>
-          <w:szCs w:val="24"/>
-          <w:lang w:val="en-US" w:eastAsia="zh-CN"/>
-        </w:rPr>
-      </w:pPr>
-      <w:r>
-        <w:rPr>
-          <w:rFonts w:hint="default" w:ascii="Arial" w:hAnsi="Arial" w:cs="Arial"/>
-          <w:b w:val="0"/>
-          <w:bCs w:val="0"/>
-          <w:sz w:val="24"/>
-          <w:szCs w:val="24"/>
-          <w:lang w:val="en-US" w:eastAsia="zh-CN"/>
-        </w:rPr>
-        <w:t>6. If the seat is available (“F”), the system changes its status to “R”.If the seat is already reserved, invalid, or restricted, the system displays an error message and skips that seat.</w:t>
-      </w:r>
-    </w:p>
-    <w:p>
-      <w:pPr>
-        <w:jc w:val="left"/>
-        <w:rPr>
-          <w:rFonts w:hint="default" w:ascii="Arial" w:hAnsi="Arial" w:cs="Arial"/>
-          <w:b w:val="0"/>
-          <w:bCs w:val="0"/>
-          <w:sz w:val="24"/>
-          <w:szCs w:val="24"/>
-          <w:lang w:val="en-US" w:eastAsia="zh-CN"/>
-        </w:rPr>
-      </w:pPr>
-      <w:r>
-        <w:rPr>
-          <w:rFonts w:hint="default" w:ascii="Arial" w:hAnsi="Arial" w:cs="Arial"/>
-          <w:b w:val="0"/>
-          <w:bCs w:val="0"/>
-          <w:sz w:val="24"/>
-          <w:szCs w:val="24"/>
-          <w:lang w:val="en-US" w:eastAsia="zh-CN"/>
-        </w:rPr>
-        <w:t>7.After all seat selections are processed, the system displays the updated seat layout.</w:t>
-      </w:r>
-    </w:p>
-    <w:p>
-      <w:pPr>
-        <w:jc w:val="left"/>
-        <w:rPr>
-          <w:rFonts w:hint="default" w:ascii="Arial" w:hAnsi="Arial" w:cs="Arial"/>
-          <w:b w:val="0"/>
-          <w:bCs w:val="0"/>
-          <w:sz w:val="24"/>
-          <w:szCs w:val="24"/>
-          <w:lang w:val="en-US" w:eastAsia="zh-CN"/>
-        </w:rPr>
-      </w:pPr>
-    </w:p>
-    <w:p>
-      <w:pPr>
-        <w:jc w:val="left"/>
-        <w:rPr>
-          <w:rFonts w:hint="default" w:ascii="Arial" w:hAnsi="Arial" w:cs="Arial"/>
-          <w:b w:val="0"/>
-          <w:bCs w:val="0"/>
-          <w:sz w:val="24"/>
-          <w:szCs w:val="24"/>
-          <w:lang w:val="en-US" w:eastAsia="zh-CN"/>
-        </w:rPr>
-      </w:pPr>
-      <w:r>
-        <w:rPr>
-          <w:rFonts w:hint="default" w:ascii="Arial" w:hAnsi="Arial" w:cs="Arial"/>
-          <w:b w:val="0"/>
-          <w:bCs w:val="0"/>
-          <w:sz w:val="24"/>
-          <w:szCs w:val="24"/>
-          <w:lang w:val="en-US" w:eastAsia="zh-CN"/>
-        </w:rPr>
-        <w:t>This additional functionality improves the usability of the application and reflects a common feature in real airline booking systems.</w:t>
-      </w:r>
-    </w:p>
-    <w:p>
-      <w:pPr>
-        <w:jc w:val="left"/>
-        <w:rPr>
-          <w:rFonts w:hint="default" w:ascii="Arial" w:hAnsi="Arial" w:cs="Arial"/>
-          <w:b w:val="0"/>
-          <w:bCs w:val="0"/>
-          <w:sz w:val="24"/>
-          <w:szCs w:val="24"/>
-          <w:lang w:val="en-US" w:eastAsia="zh-CN"/>
-        </w:rPr>
-      </w:pPr>
-    </w:p>
-    <w:p>
-      <w:pPr>
-        <w:jc w:val="left"/>
-        <w:rPr>
-          <w:rFonts w:hint="default" w:ascii="Arial" w:hAnsi="Arial" w:cs="Arial"/>
-          <w:b w:val="0"/>
-          <w:bCs w:val="0"/>
-          <w:sz w:val="24"/>
-          <w:szCs w:val="24"/>
-          <w:lang w:val="en-US" w:eastAsia="zh-CN"/>
-        </w:rPr>
-      </w:pPr>
-    </w:p>
-    <w:p>
-      <w:pPr>
-        <w:jc w:val="left"/>
-        <w:rPr>
-          <w:rFonts w:hint="eastAsia" w:ascii="Arial" w:hAnsi="Arial" w:cs="Arial"/>
-          <w:b w:val="0"/>
-          <w:bCs w:val="0"/>
-          <w:sz w:val="24"/>
-          <w:szCs w:val="24"/>
-          <w:lang w:val="en-US" w:eastAsia="zh-CN"/>
-        </w:rPr>
-      </w:pPr>
-      <w:r>
-        <w:rPr>
-          <w:rFonts w:hint="eastAsia" w:ascii="Arial" w:hAnsi="Arial" w:cs="Arial"/>
-          <w:b w:val="0"/>
-          <w:bCs w:val="0"/>
-          <w:sz w:val="24"/>
-          <w:szCs w:val="24"/>
-          <w:lang w:val="en-US" w:eastAsia="zh-CN"/>
-        </w:rPr>
-        <w:t>A.6 Version control using GitHub</w:t>
-      </w:r>
-    </w:p>
-    <w:p>
-      <w:pPr>
-        <w:jc w:val="left"/>
-        <w:rPr>
-          <w:rFonts w:hint="eastAsia" w:ascii="Arial" w:hAnsi="Arial" w:cs="Arial"/>
-          <w:b w:val="0"/>
-          <w:bCs w:val="0"/>
-          <w:sz w:val="24"/>
-          <w:szCs w:val="24"/>
-          <w:lang w:val="en-US" w:eastAsia="zh-CN"/>
-        </w:rPr>
-      </w:pPr>
-      <w:r>
-        <w:rPr>
-          <w:rFonts w:hint="eastAsia" w:ascii="Arial" w:hAnsi="Arial" w:cs="Arial"/>
-          <w:b w:val="0"/>
-          <w:bCs w:val="0"/>
-          <w:sz w:val="24"/>
-          <w:szCs w:val="24"/>
-          <w:lang w:val="en-US" w:eastAsia="zh-CN"/>
-        </w:rPr>
-        <w:t>To maintain version control of the project, a public GitHub repository was created. The following steps were followed to upload the code to GitHub.</w:t>
-      </w:r>
-    </w:p>
-    <w:p>
-      <w:pPr>
-        <w:jc w:val="left"/>
-        <w:rPr>
-          <w:rFonts w:hint="eastAsia" w:ascii="Arial" w:hAnsi="Arial" w:cs="Arial"/>
-          <w:b w:val="0"/>
-          <w:bCs w:val="0"/>
-          <w:sz w:val="24"/>
-          <w:szCs w:val="24"/>
-          <w:lang w:val="en-US" w:eastAsia="zh-CN"/>
-        </w:rPr>
-      </w:pPr>
-    </w:p>
-    <w:p>
-      <w:pPr>
-        <w:jc w:val="left"/>
-        <w:rPr>
-          <w:rFonts w:hint="eastAsia" w:ascii="Arial" w:hAnsi="Arial" w:cs="Arial"/>
-          <w:b w:val="0"/>
-          <w:bCs w:val="0"/>
-          <w:sz w:val="24"/>
-          <w:szCs w:val="24"/>
-          <w:lang w:val="en-US" w:eastAsia="zh-CN"/>
-        </w:rPr>
-      </w:pPr>
-      <w:r>
-        <w:rPr>
-          <w:rFonts w:hint="eastAsia" w:ascii="Arial" w:hAnsi="Arial" w:cs="Arial"/>
-          <w:b w:val="0"/>
-          <w:bCs w:val="0"/>
-          <w:sz w:val="24"/>
-          <w:szCs w:val="24"/>
-          <w:lang w:val="en-US" w:eastAsia="zh-CN"/>
-        </w:rPr>
-        <w:t>1. Create a repository</w:t>
-      </w:r>
-    </w:p>
-    <w:p>
-      <w:pPr>
-        <w:jc w:val="left"/>
-        <w:rPr>
-          <w:rFonts w:hint="eastAsia" w:ascii="Arial" w:hAnsi="Arial" w:cs="Arial"/>
-          <w:b w:val="0"/>
-          <w:bCs w:val="0"/>
-          <w:sz w:val="24"/>
-          <w:szCs w:val="24"/>
-          <w:lang w:val="en-US" w:eastAsia="zh-CN"/>
-        </w:rPr>
-      </w:pPr>
-      <w:r>
-        <w:rPr>
-          <w:rFonts w:hint="eastAsia" w:ascii="Arial" w:hAnsi="Arial" w:cs="Arial"/>
-          <w:b w:val="0"/>
-          <w:bCs w:val="0"/>
-          <w:sz w:val="24"/>
-          <w:szCs w:val="24"/>
-          <w:lang w:val="en-US" w:eastAsia="zh-CN"/>
-        </w:rPr>
-        <w:t>A new repository was created on GitHub under my account. The repository was named:apache-airlines-seat-booking</w:t>
-      </w:r>
-    </w:p>
-    <w:p>
-      <w:pPr>
-        <w:jc w:val="left"/>
-        <w:rPr>
-          <w:rFonts w:hint="eastAsia" w:ascii="Arial" w:hAnsi="Arial" w:cs="Arial"/>
-          <w:b w:val="0"/>
-          <w:bCs w:val="0"/>
-          <w:sz w:val="24"/>
-          <w:szCs w:val="24"/>
-          <w:lang w:val="en-US" w:eastAsia="zh-CN"/>
-        </w:rPr>
-      </w:pPr>
-    </w:p>
-    <w:p>
-      <w:pPr>
-        <w:jc w:val="left"/>
-        <w:rPr>
-          <w:rFonts w:hint="eastAsia" w:ascii="Arial" w:hAnsi="Arial" w:cs="Arial"/>
-          <w:b w:val="0"/>
-          <w:bCs w:val="0"/>
-          <w:sz w:val="24"/>
-          <w:szCs w:val="24"/>
-          <w:lang w:val="en-US" w:eastAsia="zh-CN"/>
-        </w:rPr>
-      </w:pPr>
-      <w:r>
-        <w:rPr>
-          <w:rFonts w:hint="eastAsia" w:ascii="Arial" w:hAnsi="Arial" w:cs="Arial"/>
-          <w:b w:val="0"/>
-          <w:bCs w:val="0"/>
-          <w:sz w:val="24"/>
-          <w:szCs w:val="24"/>
-          <w:lang w:val="en-US" w:eastAsia="zh-CN"/>
-        </w:rPr>
-        <w:t>2. Initialize Git in the project folder</w:t>
-      </w:r>
-    </w:p>
-    <w:p>
-      <w:pPr>
-        <w:jc w:val="left"/>
-        <w:rPr>
-          <w:rFonts w:hint="eastAsia" w:ascii="Arial" w:hAnsi="Arial" w:cs="Arial"/>
-          <w:b w:val="0"/>
-          <w:bCs w:val="0"/>
-          <w:sz w:val="24"/>
-          <w:szCs w:val="24"/>
-          <w:lang w:val="en-US" w:eastAsia="zh-CN"/>
-        </w:rPr>
-      </w:pPr>
-      <w:r>
-        <w:rPr>
-          <w:rFonts w:hint="eastAsia" w:ascii="Arial" w:hAnsi="Arial" w:cs="Arial"/>
-          <w:b w:val="0"/>
-          <w:bCs w:val="0"/>
-          <w:sz w:val="24"/>
-          <w:szCs w:val="24"/>
-          <w:lang w:val="en-US" w:eastAsia="zh-CN"/>
-        </w:rPr>
-        <w:t>Inside the project directory, Git was initialized using the command:</w:t>
-      </w:r>
-    </w:p>
-    <w:p>
-      <w:pPr>
-        <w:jc w:val="left"/>
-        <w:rPr>
-          <w:rFonts w:hint="eastAsia" w:ascii="Arial" w:hAnsi="Arial" w:cs="Arial"/>
-          <w:b w:val="0"/>
-          <w:bCs w:val="0"/>
-          <w:sz w:val="24"/>
-          <w:szCs w:val="24"/>
-          <w:lang w:val="en-US" w:eastAsia="zh-CN"/>
-        </w:rPr>
-      </w:pPr>
-      <w:r>
-        <w:rPr>
-          <w:rFonts w:hint="eastAsia" w:ascii="Arial" w:hAnsi="Arial" w:cs="Arial"/>
-          <w:b w:val="0"/>
-          <w:bCs w:val="0"/>
-          <w:sz w:val="24"/>
-          <w:szCs w:val="24"/>
-          <w:lang w:val="en-US" w:eastAsia="zh-CN"/>
-        </w:rPr>
-        <w:t>"git init"</w:t>
-      </w:r>
-    </w:p>
-    <w:p>
-      <w:pPr>
-        <w:jc w:val="left"/>
-        <w:rPr>
-          <w:rFonts w:hint="eastAsia" w:ascii="Arial" w:hAnsi="Arial" w:cs="Arial"/>
-          <w:b w:val="0"/>
-          <w:bCs w:val="0"/>
-          <w:sz w:val="24"/>
-          <w:szCs w:val="24"/>
-          <w:lang w:val="en-US" w:eastAsia="zh-CN"/>
-        </w:rPr>
-      </w:pPr>
-    </w:p>
-    <w:p>
-      <w:pPr>
-        <w:jc w:val="left"/>
-        <w:rPr>
-          <w:rFonts w:hint="eastAsia" w:ascii="Arial" w:hAnsi="Arial" w:cs="Arial"/>
-          <w:b w:val="0"/>
-          <w:bCs w:val="0"/>
-          <w:sz w:val="24"/>
-          <w:szCs w:val="24"/>
-          <w:lang w:val="en-US" w:eastAsia="zh-CN"/>
-        </w:rPr>
-      </w:pPr>
-      <w:r>
-        <w:rPr>
-          <w:rFonts w:hint="eastAsia" w:ascii="Arial" w:hAnsi="Arial" w:cs="Arial"/>
-          <w:b w:val="0"/>
-          <w:bCs w:val="0"/>
-          <w:sz w:val="24"/>
-          <w:szCs w:val="24"/>
-          <w:lang w:val="en-US" w:eastAsia="zh-CN"/>
-        </w:rPr>
-        <w:t>3. Add project files</w:t>
-      </w:r>
-    </w:p>
-    <w:p>
-      <w:pPr>
-        <w:jc w:val="left"/>
-        <w:rPr>
-          <w:rFonts w:hint="eastAsia" w:ascii="Arial" w:hAnsi="Arial" w:cs="Arial"/>
-          <w:b w:val="0"/>
-          <w:bCs w:val="0"/>
-          <w:sz w:val="24"/>
-          <w:szCs w:val="24"/>
-          <w:lang w:val="en-US" w:eastAsia="zh-CN"/>
-        </w:rPr>
-      </w:pPr>
-      <w:r>
-        <w:rPr>
-          <w:rFonts w:hint="eastAsia" w:ascii="Arial" w:hAnsi="Arial" w:cs="Arial"/>
-          <w:b w:val="0"/>
-          <w:bCs w:val="0"/>
-          <w:sz w:val="24"/>
-          <w:szCs w:val="24"/>
-          <w:lang w:val="en-US" w:eastAsia="zh-CN"/>
-        </w:rPr>
-        <w:t>All Python source files were added to the staging area using:</w:t>
-      </w:r>
-    </w:p>
-    <w:p>
-      <w:pPr>
-        <w:jc w:val="left"/>
-        <w:rPr>
-          <w:rFonts w:hint="eastAsia" w:ascii="Arial" w:hAnsi="Arial" w:cs="Arial"/>
-          <w:b w:val="0"/>
-          <w:bCs w:val="0"/>
-          <w:sz w:val="24"/>
-          <w:szCs w:val="24"/>
-          <w:lang w:val="en-US" w:eastAsia="zh-CN"/>
-        </w:rPr>
-      </w:pPr>
-      <w:r>
-        <w:rPr>
-          <w:rFonts w:hint="eastAsia" w:ascii="Arial" w:hAnsi="Arial" w:cs="Arial"/>
-          <w:b w:val="0"/>
-          <w:bCs w:val="0"/>
-          <w:sz w:val="24"/>
-          <w:szCs w:val="24"/>
-          <w:lang w:val="en-US" w:eastAsia="zh-CN"/>
-        </w:rPr>
-        <w:t>"git add ."</w:t>
-      </w:r>
-    </w:p>
-    <w:p>
-      <w:pPr>
-        <w:jc w:val="left"/>
-        <w:rPr>
-          <w:rFonts w:hint="eastAsia" w:ascii="Arial" w:hAnsi="Arial" w:cs="Arial"/>
-          <w:b w:val="0"/>
-          <w:bCs w:val="0"/>
-          <w:sz w:val="24"/>
-          <w:szCs w:val="24"/>
-          <w:lang w:val="en-US" w:eastAsia="zh-CN"/>
-        </w:rPr>
-      </w:pPr>
-    </w:p>
-    <w:p>
-      <w:pPr>
-        <w:jc w:val="left"/>
-        <w:rPr>
-          <w:rFonts w:hint="eastAsia" w:ascii="Arial" w:hAnsi="Arial" w:cs="Arial"/>
-          <w:b w:val="0"/>
-          <w:bCs w:val="0"/>
-          <w:sz w:val="24"/>
-          <w:szCs w:val="24"/>
-          <w:lang w:val="en-US" w:eastAsia="zh-CN"/>
-        </w:rPr>
-      </w:pPr>
-      <w:r>
-        <w:rPr>
-          <w:rFonts w:hint="eastAsia" w:ascii="Arial" w:hAnsi="Arial" w:cs="Arial"/>
-          <w:b w:val="0"/>
-          <w:bCs w:val="0"/>
-          <w:sz w:val="24"/>
-          <w:szCs w:val="24"/>
-          <w:lang w:val="en-US" w:eastAsia="zh-CN"/>
-        </w:rPr>
-        <w:t>4. Commit the files</w:t>
-      </w:r>
-    </w:p>
-    <w:p>
-      <w:pPr>
-        <w:jc w:val="left"/>
-        <w:rPr>
-          <w:rFonts w:hint="eastAsia" w:ascii="Arial" w:hAnsi="Arial" w:cs="Arial"/>
-          <w:b w:val="0"/>
-          <w:bCs w:val="0"/>
-          <w:sz w:val="24"/>
-          <w:szCs w:val="24"/>
-          <w:lang w:val="en-US" w:eastAsia="zh-CN"/>
-        </w:rPr>
-      </w:pPr>
-      <w:r>
-        <w:rPr>
-          <w:rFonts w:hint="eastAsia" w:ascii="Arial" w:hAnsi="Arial" w:cs="Arial"/>
-          <w:b w:val="0"/>
-          <w:bCs w:val="0"/>
-          <w:sz w:val="24"/>
-          <w:szCs w:val="24"/>
-          <w:lang w:val="en-US" w:eastAsia="zh-CN"/>
-        </w:rPr>
-        <w:t>The project files were committed with the following command:</w:t>
-      </w:r>
-    </w:p>
-    <w:p>
-      <w:pPr>
-        <w:jc w:val="left"/>
-        <w:rPr>
-          <w:rFonts w:hint="eastAsia" w:ascii="Arial" w:hAnsi="Arial" w:cs="Arial"/>
-          <w:b w:val="0"/>
-          <w:bCs w:val="0"/>
-          <w:sz w:val="24"/>
-          <w:szCs w:val="24"/>
-          <w:lang w:val="en-US" w:eastAsia="zh-CN"/>
-        </w:rPr>
-      </w:pPr>
-      <w:r>
-        <w:rPr>
-          <w:rFonts w:hint="eastAsia" w:ascii="Arial" w:hAnsi="Arial" w:cs="Arial"/>
-          <w:b w:val="0"/>
-          <w:bCs w:val="0"/>
-          <w:sz w:val="24"/>
-          <w:szCs w:val="24"/>
-          <w:lang w:val="en-US" w:eastAsia="zh-CN"/>
-        </w:rPr>
-        <w:t>"git commit -m "Initial seat booking system implementation"</w:t>
-      </w:r>
-    </w:p>
-    <w:p>
-      <w:pPr>
-        <w:jc w:val="left"/>
-        <w:rPr>
-          <w:rFonts w:hint="eastAsia" w:ascii="Arial" w:hAnsi="Arial" w:cs="Arial"/>
-          <w:b w:val="0"/>
-          <w:bCs w:val="0"/>
-          <w:sz w:val="24"/>
-          <w:szCs w:val="24"/>
-          <w:lang w:val="en-US" w:eastAsia="zh-CN"/>
-        </w:rPr>
-      </w:pPr>
-    </w:p>
-    <w:p>
-      <w:pPr>
-        <w:jc w:val="left"/>
-        <w:rPr>
-          <w:rFonts w:hint="eastAsia" w:ascii="Arial" w:hAnsi="Arial" w:cs="Arial"/>
-          <w:b w:val="0"/>
-          <w:bCs w:val="0"/>
-          <w:sz w:val="24"/>
-          <w:szCs w:val="24"/>
-          <w:lang w:val="en-US" w:eastAsia="zh-CN"/>
-        </w:rPr>
-      </w:pPr>
-      <w:r>
-        <w:rPr>
-          <w:rFonts w:hint="eastAsia" w:ascii="Arial" w:hAnsi="Arial" w:cs="Arial"/>
-          <w:b w:val="0"/>
-          <w:bCs w:val="0"/>
-          <w:sz w:val="24"/>
-          <w:szCs w:val="24"/>
-          <w:lang w:val="en-US" w:eastAsia="zh-CN"/>
-        </w:rPr>
-        <w:t>5. Connect to GitHub repository</w:t>
-      </w:r>
-    </w:p>
-    <w:p>
-      <w:pPr>
-        <w:jc w:val="left"/>
-        <w:rPr>
-          <w:rFonts w:hint="eastAsia" w:ascii="Arial" w:hAnsi="Arial" w:cs="Arial"/>
-          <w:b w:val="0"/>
-          <w:bCs w:val="0"/>
-          <w:sz w:val="24"/>
-          <w:szCs w:val="24"/>
-          <w:lang w:val="en-US" w:eastAsia="zh-CN"/>
-        </w:rPr>
-      </w:pPr>
-      <w:r>
-        <w:rPr>
-          <w:rFonts w:hint="eastAsia" w:ascii="Arial" w:hAnsi="Arial" w:cs="Arial"/>
-          <w:b w:val="0"/>
-          <w:bCs w:val="0"/>
-          <w:sz w:val="24"/>
-          <w:szCs w:val="24"/>
-          <w:lang w:val="en-US" w:eastAsia="zh-CN"/>
-        </w:rPr>
-        <w:t>The local repository was connected to the remote GitHub repository using:</w:t>
-      </w:r>
-    </w:p>
-    <w:p>
-      <w:pPr>
-        <w:jc w:val="left"/>
-        <w:rPr>
-          <w:rFonts w:hint="eastAsia" w:ascii="Arial" w:hAnsi="Arial" w:cs="Arial"/>
-          <w:b w:val="0"/>
-          <w:bCs w:val="0"/>
-          <w:sz w:val="24"/>
-          <w:szCs w:val="24"/>
-          <w:lang w:val="en-US" w:eastAsia="zh-CN"/>
-        </w:rPr>
-      </w:pPr>
-      <w:r>
-        <w:rPr>
-          <w:rFonts w:hint="eastAsia" w:ascii="Arial" w:hAnsi="Arial" w:cs="Arial"/>
-          <w:b w:val="0"/>
-          <w:bCs w:val="0"/>
-          <w:sz w:val="24"/>
-          <w:szCs w:val="24"/>
-          <w:lang w:val="en-US" w:eastAsia="zh-CN"/>
-        </w:rPr>
-        <w:t>"git remote add origin https://github.com/zeshuochen/apache-airlines-seat-booking"</w:t>
-      </w:r>
-    </w:p>
-    <w:p>
-      <w:pPr>
-        <w:jc w:val="left"/>
-        <w:rPr>
-          <w:rFonts w:hint="eastAsia" w:ascii="Arial" w:hAnsi="Arial" w:cs="Arial"/>
-          <w:b w:val="0"/>
-          <w:bCs w:val="0"/>
-          <w:sz w:val="24"/>
-          <w:szCs w:val="24"/>
-          <w:lang w:val="en-US" w:eastAsia="zh-CN"/>
-        </w:rPr>
-      </w:pPr>
-    </w:p>
-    <w:p>
-      <w:pPr>
-        <w:jc w:val="left"/>
-        <w:rPr>
-          <w:rFonts w:hint="eastAsia" w:ascii="Arial" w:hAnsi="Arial" w:cs="Arial"/>
-          <w:b w:val="0"/>
-          <w:bCs w:val="0"/>
-          <w:sz w:val="24"/>
-          <w:szCs w:val="24"/>
-          <w:lang w:val="en-US" w:eastAsia="zh-CN"/>
-        </w:rPr>
-      </w:pPr>
-      <w:r>
-        <w:rPr>
-          <w:rFonts w:hint="eastAsia" w:ascii="Arial" w:hAnsi="Arial" w:cs="Arial"/>
-          <w:b w:val="0"/>
-          <w:bCs w:val="0"/>
-          <w:sz w:val="24"/>
-          <w:szCs w:val="24"/>
-          <w:lang w:val="en-US" w:eastAsia="zh-CN"/>
-        </w:rPr>
-        <w:t>6. Push the code</w:t>
-      </w:r>
-    </w:p>
-    <w:p>
-      <w:pPr>
-        <w:jc w:val="left"/>
-        <w:rPr>
-          <w:rFonts w:hint="eastAsia" w:ascii="Arial" w:hAnsi="Arial" w:cs="Arial"/>
-          <w:b w:val="0"/>
-          <w:bCs w:val="0"/>
-          <w:sz w:val="24"/>
-          <w:szCs w:val="24"/>
-          <w:lang w:val="en-US" w:eastAsia="zh-CN"/>
-        </w:rPr>
-      </w:pPr>
-      <w:r>
-        <w:rPr>
-          <w:rFonts w:hint="eastAsia" w:ascii="Arial" w:hAnsi="Arial" w:cs="Arial"/>
-          <w:b w:val="0"/>
-          <w:bCs w:val="0"/>
-          <w:sz w:val="24"/>
-          <w:szCs w:val="24"/>
-          <w:lang w:val="en-US" w:eastAsia="zh-CN"/>
-        </w:rPr>
-        <w:t>Finally, the code was uploaded to GitHub using:</w:t>
-      </w:r>
-    </w:p>
-    <w:p>
-      <w:pPr>
-        <w:jc w:val="left"/>
-        <w:rPr>
-          <w:rFonts w:hint="eastAsia" w:ascii="Arial" w:hAnsi="Arial" w:cs="Arial"/>
-          <w:b w:val="0"/>
-          <w:bCs w:val="0"/>
-          <w:sz w:val="24"/>
-          <w:szCs w:val="24"/>
-          <w:lang w:val="en-US" w:eastAsia="zh-CN"/>
-        </w:rPr>
-      </w:pPr>
-      <w:r>
-        <w:rPr>
-          <w:rFonts w:hint="eastAsia" w:ascii="Arial" w:hAnsi="Arial" w:cs="Arial"/>
-          <w:b w:val="0"/>
-          <w:bCs w:val="0"/>
-          <w:sz w:val="24"/>
-          <w:szCs w:val="24"/>
-          <w:lang w:val="en-US" w:eastAsia="zh-CN"/>
-        </w:rPr>
-        <w:t>"git push -u origin main"</w:t>
-      </w:r>
-    </w:p>
-    <w:p>
-      <w:pPr>
-        <w:jc w:val="left"/>
-        <w:rPr>
-          <w:rFonts w:hint="eastAsia" w:ascii="Arial" w:hAnsi="Arial" w:cs="Arial"/>
-          <w:b w:val="0"/>
-          <w:bCs w:val="0"/>
-          <w:sz w:val="24"/>
-          <w:szCs w:val="24"/>
-          <w:lang w:val="en-US" w:eastAsia="zh-CN"/>
-        </w:rPr>
-      </w:pPr>
-    </w:p>
-    <w:p>
-      <w:pPr>
-        <w:jc w:val="left"/>
-        <w:rPr>
-          <w:rFonts w:hint="eastAsia" w:ascii="Arial" w:hAnsi="Arial" w:cs="Arial"/>
-          <w:b w:val="0"/>
-          <w:bCs w:val="0"/>
-          <w:sz w:val="24"/>
-          <w:szCs w:val="24"/>
-          <w:lang w:val="en-US" w:eastAsia="zh-CN"/>
-        </w:rPr>
-      </w:pPr>
-      <w:r>
-        <w:rPr>
-          <w:rFonts w:hint="eastAsia" w:ascii="Arial" w:hAnsi="Arial" w:cs="Arial"/>
+      <w:r>
+        <w:rPr>
+          <w:rFonts w:hint="eastAsia" w:ascii="Arial" w:hAnsi="Arial" w:cs="Arial"/>
+          <w:b w:val="0"/>
+          <w:bCs w:val="0"/>
+          <w:sz w:val="24"/>
+          <w:szCs w:val="24"/>
+          <w:lang w:val="en-US" w:eastAsia="zh-CN"/>
+        </w:rPr>
+        <w:t>Commit: Refactor booking system to support unique booking references and database storage.</w:t>
+      </w:r>
+    </w:p>
+    <w:p>
+      <w:pPr>
+        <w:jc w:val="left"/>
+        <w:rPr>
+          <w:rFonts w:hint="eastAsia" w:ascii="Arial" w:hAnsi="Arial" w:cs="Arial"/>
+          <w:b w:val="0"/>
+          <w:bCs w:val="0"/>
+          <w:sz w:val="24"/>
+          <w:szCs w:val="24"/>
+          <w:lang w:val="en-US" w:eastAsia="zh-CN"/>
+        </w:rPr>
+      </w:pPr>
+      <w:r>
+        <w:rPr>
+          <w:rFonts w:hint="eastAsia" w:ascii="Arial" w:hAnsi="Arial" w:cs="Arial"/>
+          <w:b w:val="0"/>
+          <w:bCs w:val="0"/>
+          <w:sz w:val="24"/>
+          <w:szCs w:val="24"/>
+          <w:lang w:val="en-US" w:eastAsia="zh-CN"/>
+        </w:rPr>
+        <w:t>1. Implement algorithm to generate a unique 8-character alphanumeric booking reference.</w:t>
+      </w:r>
+    </w:p>
+    <w:p>
+      <w:pPr>
+        <w:jc w:val="left"/>
+        <w:rPr>
+          <w:rFonts w:hint="eastAsia" w:ascii="Arial" w:hAnsi="Arial" w:cs="Arial"/>
+          <w:b w:val="0"/>
+          <w:bCs w:val="0"/>
+          <w:sz w:val="24"/>
+          <w:szCs w:val="24"/>
+          <w:lang w:val="en-US" w:eastAsia="zh-CN"/>
+        </w:rPr>
+      </w:pPr>
+      <w:r>
+        <w:rPr>
+          <w:rFonts w:hint="eastAsia" w:ascii="Arial" w:hAnsi="Arial" w:cs="Arial"/>
+          <w:b w:val="0"/>
+          <w:bCs w:val="0"/>
+          <w:sz w:val="24"/>
+          <w:szCs w:val="24"/>
+          <w:lang w:val="en-US" w:eastAsia="zh-CN"/>
+        </w:rPr>
+        <w:t>2. Store booking reference in the seat data structure instead of the letter "R".</w:t>
+      </w:r>
+    </w:p>
+    <w:p>
+      <w:pPr>
+        <w:jc w:val="left"/>
+        <w:rPr>
+          <w:rFonts w:hint="eastAsia" w:ascii="Arial" w:hAnsi="Arial" w:cs="Arial"/>
+          <w:b w:val="0"/>
+          <w:bCs w:val="0"/>
+          <w:sz w:val="24"/>
+          <w:szCs w:val="24"/>
+          <w:lang w:val="en-US" w:eastAsia="zh-CN"/>
+        </w:rPr>
+      </w:pPr>
+      <w:r>
+        <w:rPr>
+          <w:rFonts w:hint="eastAsia" w:ascii="Arial" w:hAnsi="Arial" w:cs="Arial"/>
+          <w:b w:val="0"/>
+          <w:bCs w:val="0"/>
+          <w:sz w:val="24"/>
+          <w:szCs w:val="24"/>
+          <w:lang w:val="en-US" w:eastAsia="zh-CN"/>
+        </w:rPr>
+        <w:t>3. Integrate SQLite database to store passenger details and seat information.</w:t>
+      </w:r>
+    </w:p>
+    <w:p>
+      <w:pPr>
+        <w:jc w:val="left"/>
+        <w:rPr>
+          <w:rFonts w:hint="eastAsia" w:ascii="Arial" w:hAnsi="Arial" w:cs="Arial"/>
+          <w:b w:val="0"/>
+          <w:bCs w:val="0"/>
+          <w:sz w:val="24"/>
+          <w:szCs w:val="24"/>
+          <w:lang w:val="en-US" w:eastAsia="zh-CN"/>
+        </w:rPr>
+      </w:pPr>
+      <w:r>
+        <w:rPr>
+          <w:rFonts w:hint="eastAsia" w:ascii="Arial" w:hAnsi="Arial" w:cs="Arial"/>
+          <w:b w:val="0"/>
+          <w:bCs w:val="0"/>
+          <w:sz w:val="24"/>
+          <w:szCs w:val="24"/>
+          <w:lang w:val="en-US" w:eastAsia="zh-CN"/>
+        </w:rPr>
+        <w:t>4. Insert booking records into the database when a seat is booked.</w:t>
+      </w:r>
+    </w:p>
+    <w:p>
+      <w:pPr>
+        <w:jc w:val="left"/>
+        <w:rPr>
+          <w:rFonts w:hint="eastAsia" w:ascii="Arial" w:hAnsi="Arial" w:cs="Arial"/>
+          <w:b w:val="0"/>
+          <w:bCs w:val="0"/>
+          <w:sz w:val="24"/>
+          <w:szCs w:val="24"/>
+          <w:lang w:val="en-US" w:eastAsia="zh-CN"/>
+        </w:rPr>
+      </w:pPr>
+      <w:r>
+        <w:rPr>
+          <w:rFonts w:hint="eastAsia" w:ascii="Arial" w:hAnsi="Arial" w:cs="Arial"/>
+          <w:b w:val="0"/>
+          <w:bCs w:val="0"/>
+          <w:sz w:val="24"/>
+          <w:szCs w:val="24"/>
+          <w:lang w:val="en-US" w:eastAsia="zh-CN"/>
+        </w:rPr>
+        <w:t>5. Remove booking records from the database when a seat is freed.</w:t>
+      </w:r>
+    </w:p>
+    <w:p>
+      <w:pPr>
+        <w:jc w:val="left"/>
+        <w:rPr>
+          <w:rFonts w:hint="eastAsia" w:ascii="Arial" w:hAnsi="Arial" w:cs="Arial"/>
+          <w:b w:val="0"/>
+          <w:bCs w:val="0"/>
+          <w:sz w:val="24"/>
+          <w:szCs w:val="24"/>
+          <w:lang w:val="en-US" w:eastAsia="zh-CN"/>
+        </w:rPr>
+      </w:pPr>
+      <w:r>
+        <w:rPr>
+          <w:rFonts w:hint="eastAsia" w:ascii="Arial" w:hAnsi="Arial" w:cs="Arial"/>
+          <w:b w:val="0"/>
+          <w:bCs w:val="0"/>
+          <w:sz w:val="24"/>
+          <w:szCs w:val="24"/>
+          <w:lang w:val="en-US" w:eastAsia="zh-CN"/>
+        </w:rPr>
+        <w:t>6. Add functionality to search booking details using a booking reference.</w:t>
+      </w:r>
+    </w:p>
+    <w:p>
+      <w:pPr>
+        <w:jc w:val="left"/>
+        <w:rPr>
+          <w:rFonts w:hint="eastAsia" w:ascii="Arial" w:hAnsi="Arial" w:cs="Arial"/>
+          <w:b w:val="0"/>
+          <w:bCs w:val="0"/>
+          <w:sz w:val="24"/>
+          <w:szCs w:val="24"/>
+          <w:lang w:val="en-US" w:eastAsia="zh-CN"/>
+        </w:rPr>
+      </w:pPr>
+      <w:r>
+        <w:rPr>
+          <w:rFonts w:hint="eastAsia" w:ascii="Arial" w:hAnsi="Arial" w:cs="Arial"/>
+          <w:b w:val="0"/>
+          <w:bCs w:val="0"/>
+          <w:sz w:val="24"/>
+          <w:szCs w:val="24"/>
+          <w:lang w:val="en-US" w:eastAsia="zh-CN"/>
+        </w:rPr>
+        <w:t>7. The activity diagram was updated</w:t>
+      </w:r>
+    </w:p>
+    <w:bookmarkEnd w:id="0"/>
+    <w:p>
+      <w:pPr>
+        <w:jc w:val="left"/>
+        <w:rPr>
+          <w:rFonts w:hint="default" w:ascii="Arial" w:hAnsi="Arial" w:cs="Arial"/>
+          <w:b w:val="0"/>
+          <w:bCs w:val="0"/>
+          <w:sz w:val="24"/>
+          <w:szCs w:val="24"/>
+          <w:lang w:val="en-US" w:eastAsia="zh-CN"/>
+        </w:rPr>
+      </w:pPr>
+    </w:p>
+    <w:p>
+      <w:pPr>
+        <w:jc w:val="left"/>
+        <w:rPr>
+          <w:rFonts w:hint="default" w:ascii="Arial" w:hAnsi="Arial" w:cs="Arial"/>
+          <w:b w:val="0"/>
+          <w:bCs w:val="0"/>
+          <w:sz w:val="24"/>
+          <w:szCs w:val="24"/>
+          <w:lang w:val="en-US" w:eastAsia="zh-CN"/>
+        </w:rPr>
+      </w:pPr>
+      <w:r>
+        <w:rPr>
+          <w:rFonts w:hint="eastAsia" w:ascii="Arial" w:hAnsi="Arial" w:cs="Arial"/>
+          <w:b w:val="0"/>
+          <w:bCs w:val="0"/>
+          <w:sz w:val="24"/>
+          <w:szCs w:val="24"/>
+          <w:lang w:val="en-US" w:eastAsia="zh-CN"/>
+        </w:rPr>
+        <w:t>git command：</w:t>
+      </w:r>
+    </w:p>
+    <w:p>
+      <w:pPr>
+        <w:jc w:val="left"/>
+        <w:rPr>
+          <w:rFonts w:hint="default" w:ascii="Arial" w:hAnsi="Arial" w:cs="Arial"/>
+          <w:b w:val="0"/>
+          <w:bCs w:val="0"/>
+          <w:sz w:val="24"/>
+          <w:szCs w:val="24"/>
+          <w:lang w:val="en-US" w:eastAsia="zh-CN"/>
+        </w:rPr>
+      </w:pPr>
+      <w:r>
+        <w:rPr>
+          <w:rFonts w:hint="default" w:ascii="Arial" w:hAnsi="Arial" w:cs="Arial"/>
+          <w:b w:val="0"/>
+          <w:bCs w:val="0"/>
+          <w:sz w:val="24"/>
+          <w:szCs w:val="24"/>
+          <w:lang w:val="en-US" w:eastAsia="zh-CN"/>
+        </w:rPr>
+        <w:t>“git add .”</w:t>
+      </w:r>
+    </w:p>
+    <w:p>
+      <w:pPr>
+        <w:jc w:val="left"/>
+        <w:rPr>
+          <w:rFonts w:hint="default" w:ascii="Arial" w:hAnsi="Arial" w:cs="Arial"/>
+          <w:b w:val="0"/>
+          <w:bCs w:val="0"/>
+          <w:sz w:val="24"/>
+          <w:szCs w:val="24"/>
+          <w:lang w:val="en-US" w:eastAsia="zh-CN"/>
+        </w:rPr>
+      </w:pPr>
+      <w:r>
+        <w:rPr>
+          <w:rFonts w:hint="default" w:ascii="Arial" w:hAnsi="Arial" w:cs="Arial"/>
+          <w:b w:val="0"/>
+          <w:bCs w:val="0"/>
+          <w:sz w:val="24"/>
+          <w:szCs w:val="24"/>
+          <w:lang w:val="en-US" w:eastAsia="zh-CN"/>
+        </w:rPr>
+        <w:t>“git commit -m "Refactor booking system to support unique booking references and database storage"</w:t>
+      </w:r>
+      <w:r>
+        <w:rPr>
+          <w:rFonts w:hint="eastAsia" w:ascii="Arial" w:hAnsi="Arial" w:cs="Arial"/>
+          <w:b w:val="0"/>
+          <w:bCs w:val="0"/>
+          <w:sz w:val="24"/>
+          <w:szCs w:val="24"/>
+          <w:lang w:val="en-US" w:eastAsia="zh-CN"/>
+        </w:rPr>
+        <w:t>"</w:t>
+      </w:r>
+    </w:p>
+    <w:p>
+      <w:pPr>
+        <w:jc w:val="left"/>
+        <w:rPr>
+          <w:rFonts w:hint="default" w:ascii="Arial" w:hAnsi="Arial" w:cs="Arial"/>
+          <w:b w:val="0"/>
+          <w:bCs w:val="0"/>
+          <w:sz w:val="24"/>
+          <w:szCs w:val="24"/>
+          <w:lang w:val="en-US" w:eastAsia="zh-CN"/>
+        </w:rPr>
+      </w:pPr>
+      <w:r>
+        <w:rPr>
+          <w:rFonts w:hint="default" w:ascii="Arial" w:hAnsi="Arial" w:cs="Arial"/>
+          <w:b w:val="0"/>
+          <w:bCs w:val="0"/>
+          <w:sz w:val="24"/>
+          <w:szCs w:val="24"/>
+          <w:lang w:val="en-US" w:eastAsia="zh-CN"/>
+        </w:rPr>
+        <w:t>“git push”</w:t>
+      </w:r>
+    </w:p>
+    <w:p>
+      <w:pPr>
+        <w:jc w:val="left"/>
+        <w:rPr>
+          <w:rFonts w:hint="default" w:ascii="Arial" w:hAnsi="Arial" w:cs="Arial"/>
+          <w:b w:val="0"/>
+          <w:bCs w:val="0"/>
+          <w:sz w:val="24"/>
+          <w:szCs w:val="24"/>
+          <w:lang w:val="en-US" w:eastAsia="zh-CN"/>
+        </w:rPr>
+      </w:pPr>
+    </w:p>
+    <w:p>
+      <w:pPr>
+        <w:jc w:val="left"/>
+        <w:rPr>
+          <w:rFonts w:hint="default" w:ascii="Arial" w:hAnsi="Arial" w:cs="Arial"/>
+          <w:b w:val="0"/>
+          <w:bCs w:val="0"/>
+          <w:sz w:val="24"/>
+          <w:szCs w:val="24"/>
+          <w:lang w:val="en-US" w:eastAsia="zh-CN"/>
+        </w:rPr>
+      </w:pPr>
+    </w:p>
+    <w:p>
+      <w:pPr>
+        <w:jc w:val="left"/>
+        <w:rPr>
+          <w:rFonts w:hint="default" w:ascii="Arial" w:hAnsi="Arial" w:cs="Arial"/>
+          <w:b w:val="0"/>
+          <w:bCs w:val="0"/>
+          <w:sz w:val="24"/>
+          <w:szCs w:val="24"/>
+          <w:lang w:val="en-US" w:eastAsia="zh-CN"/>
+        </w:rPr>
+      </w:pPr>
+    </w:p>
+    <w:p>
+      <w:pPr>
+        <w:jc w:val="left"/>
+        <w:rPr>
+          <w:rFonts w:hint="default" w:ascii="Arial" w:hAnsi="Arial" w:cs="Arial"/>
+          <w:b w:val="0"/>
+          <w:bCs w:val="0"/>
+          <w:sz w:val="24"/>
+          <w:szCs w:val="24"/>
+          <w:lang w:val="en-US" w:eastAsia="zh-CN"/>
+        </w:rPr>
+      </w:pPr>
+      <w:r>
+        <w:rPr>
+          <w:rFonts w:hint="default" w:ascii="Arial" w:hAnsi="Arial" w:cs="Arial"/>
+          <w:b w:val="0"/>
+          <w:bCs w:val="0"/>
+          <w:sz w:val="24"/>
+          <w:szCs w:val="24"/>
+          <w:lang w:val="en-US" w:eastAsia="zh-CN"/>
+        </w:rPr>
+        <w:t>B.3 Git Command to Show Program Updates</w:t>
+      </w:r>
+    </w:p>
+    <w:p>
+      <w:pPr>
+        <w:jc w:val="left"/>
+        <w:rPr>
+          <w:rFonts w:hint="default" w:ascii="Arial" w:hAnsi="Arial" w:cs="Arial"/>
+          <w:b w:val="0"/>
+          <w:bCs w:val="0"/>
+          <w:sz w:val="24"/>
+          <w:szCs w:val="24"/>
+          <w:lang w:val="en-US" w:eastAsia="zh-CN"/>
+        </w:rPr>
+      </w:pPr>
+      <w:r>
+        <w:rPr>
+          <w:rFonts w:hint="default" w:ascii="Arial" w:hAnsi="Arial" w:cs="Arial"/>
+          <w:b w:val="0"/>
+          <w:bCs w:val="0"/>
+          <w:sz w:val="24"/>
+          <w:szCs w:val="24"/>
+          <w:lang w:val="en-US" w:eastAsia="zh-CN"/>
+        </w:rPr>
+        <w:t>A git command that can be used to show the updates made to the program is:</w:t>
+      </w:r>
+    </w:p>
+    <w:p>
+      <w:pPr>
+        <w:jc w:val="left"/>
+        <w:rPr>
+          <w:rFonts w:hint="default" w:ascii="Arial" w:hAnsi="Arial" w:cs="Arial"/>
+          <w:b w:val="0"/>
+          <w:bCs w:val="0"/>
+          <w:sz w:val="24"/>
+          <w:szCs w:val="24"/>
+          <w:lang w:val="en-US" w:eastAsia="zh-CN"/>
+        </w:rPr>
+      </w:pPr>
+      <w:r>
+        <w:rPr>
+          <w:rFonts w:hint="default" w:ascii="Arial" w:hAnsi="Arial" w:cs="Arial"/>
+          <w:b w:val="0"/>
+          <w:bCs w:val="0"/>
+          <w:sz w:val="24"/>
+          <w:szCs w:val="24"/>
+          <w:lang w:val="en-US" w:eastAsia="zh-CN"/>
+        </w:rPr>
+        <w:t>"git diff"</w:t>
+      </w:r>
+    </w:p>
+    <w:p>
+      <w:pPr>
+        <w:jc w:val="left"/>
+        <w:rPr>
+          <w:rFonts w:hint="default" w:ascii="Arial" w:hAnsi="Arial" w:cs="Arial"/>
+          <w:b w:val="0"/>
+          <w:bCs w:val="0"/>
+          <w:sz w:val="24"/>
+          <w:szCs w:val="24"/>
+          <w:lang w:val="en-US" w:eastAsia="zh-CN"/>
+        </w:rPr>
+      </w:pPr>
+    </w:p>
+    <w:p>
+      <w:pPr>
+        <w:jc w:val="left"/>
+        <w:rPr>
+          <w:rFonts w:hint="default" w:ascii="Arial" w:hAnsi="Arial" w:cs="Arial"/>
+          <w:b w:val="0"/>
+          <w:bCs w:val="0"/>
+          <w:sz w:val="24"/>
+          <w:szCs w:val="24"/>
+          <w:lang w:val="en-US" w:eastAsia="zh-CN"/>
+        </w:rPr>
+      </w:pPr>
+      <w:r>
+        <w:rPr>
+          <w:rFonts w:hint="default" w:ascii="Arial" w:hAnsi="Arial" w:cs="Arial"/>
+          <w:b w:val="0"/>
+          <w:bCs w:val="0"/>
+          <w:sz w:val="24"/>
+          <w:szCs w:val="24"/>
+          <w:lang w:val="en-US" w:eastAsia="zh-CN"/>
+        </w:rPr>
+        <w:t>This command displays the differences between the current version of the files and the previous version. It is useful for reviewing code changes before creating a new commit. It highlights which lines have been added, removed, or modified.</w:t>
+      </w:r>
+    </w:p>
+    <w:p>
+      <w:pPr>
+        <w:jc w:val="left"/>
+        <w:rPr>
+          <w:rFonts w:hint="default" w:ascii="Arial" w:hAnsi="Arial" w:cs="Arial"/>
+          <w:b w:val="0"/>
+          <w:bCs w:val="0"/>
+          <w:sz w:val="24"/>
+          <w:szCs w:val="24"/>
+          <w:lang w:val="en-US" w:eastAsia="zh-CN"/>
+        </w:rPr>
+      </w:pPr>
+    </w:p>
+    <w:p>
+      <w:pPr>
+        <w:jc w:val="left"/>
+        <w:rPr>
+          <w:rFonts w:hint="default" w:ascii="Arial" w:hAnsi="Arial" w:cs="Arial"/>
+          <w:b w:val="0"/>
+          <w:bCs w:val="0"/>
+          <w:sz w:val="24"/>
+          <w:szCs w:val="24"/>
+          <w:lang w:val="en-US" w:eastAsia="zh-CN"/>
+        </w:rPr>
+      </w:pPr>
+      <w:r>
+        <w:rPr>
+          <w:rFonts w:hint="default" w:ascii="Arial" w:hAnsi="Arial" w:cs="Arial"/>
+          <w:b w:val="0"/>
+          <w:bCs w:val="0"/>
+          <w:sz w:val="24"/>
+          <w:szCs w:val="24"/>
+          <w:lang w:val="en-US" w:eastAsia="zh-CN"/>
+        </w:rPr>
+        <w:t>This command would show the updates made when the booking system was refactored from the Part A version into the Part B version, including the addition of the booking reference algorithm, the SQLite database connection, the database table creation method, and the new "find_booking_by_reference" functionality.</w:t>
+      </w:r>
+    </w:p>
+    <w:p>
+      <w:pPr>
+        <w:jc w:val="left"/>
+        <w:rPr>
+          <w:rFonts w:hint="default" w:ascii="Arial" w:hAnsi="Arial" w:cs="Arial"/>
+          <w:b w:val="0"/>
+          <w:bCs w:val="0"/>
+          <w:sz w:val="24"/>
+          <w:szCs w:val="24"/>
+          <w:lang w:val="en-US" w:eastAsia="zh-CN"/>
+        </w:rPr>
+      </w:pPr>
+    </w:p>
+    <w:p>
+      <w:pPr>
+        <w:jc w:val="left"/>
+        <w:rPr>
+          <w:rFonts w:hint="default" w:ascii="Arial" w:hAnsi="Arial" w:cs="Arial"/>
+          <w:b w:val="0"/>
+          <w:bCs w:val="0"/>
+          <w:sz w:val="24"/>
+          <w:szCs w:val="24"/>
+          <w:lang w:val="en-US" w:eastAsia="zh-CN"/>
+        </w:rPr>
+      </w:pPr>
+      <w:r>
+        <w:rPr>
+          <w:rFonts w:hint="default" w:ascii="Arial" w:hAnsi="Arial" w:cs="Arial"/>
           <w:b w:val="0"/>
           <w:bCs w:val="0"/>
           <w:sz w:val="24"/>
@@ -2588,7 +3734,7 @@
       </w:pPr>
       <w:r>
         <w:rPr>
-          <w:rFonts w:hint="eastAsia" w:ascii="Arial" w:hAnsi="Arial" w:cs="Arial"/>
+          <w:rFonts w:hint="default" w:ascii="Arial" w:hAnsi="Arial" w:cs="Arial"/>
           <w:b w:val="0"/>
           <w:bCs w:val="0"/>
           <w:sz w:val="24"/>
@@ -2599,7 +3745,7 @@
       </w:r>
       <w:r>
         <w:rPr>
-          <w:rFonts w:hint="eastAsia" w:ascii="Arial" w:hAnsi="Arial" w:cs="Arial"/>
+          <w:rFonts w:hint="default" w:ascii="Arial" w:hAnsi="Arial" w:cs="Arial"/>
           <w:b w:val="0"/>
           <w:bCs w:val="0"/>
           <w:sz w:val="24"/>
@@ -2610,7 +3756,7 @@
       </w:r>
       <w:r>
         <w:rPr>
-          <w:rFonts w:hint="eastAsia" w:ascii="Arial" w:hAnsi="Arial" w:cs="Arial"/>
+          <w:rFonts w:hint="default" w:ascii="Arial" w:hAnsi="Arial" w:cs="Arial"/>
           <w:b w:val="0"/>
           <w:bCs w:val="0"/>
           <w:sz w:val="24"/>
@@ -2621,8 +3767,8 @@
       </w:r>
       <w:r>
         <w:rPr>
-          <w:rStyle w:val="7"/>
-          <w:rFonts w:hint="eastAsia" w:ascii="Arial" w:hAnsi="Arial" w:cs="Arial"/>
+          <w:rStyle w:val="8"/>
+          <w:rFonts w:hint="default" w:ascii="Arial" w:hAnsi="Arial" w:cs="Arial"/>
           <w:b w:val="0"/>
           <w:bCs w:val="0"/>
           <w:sz w:val="24"/>
@@ -2633,7 +3779,7 @@
       </w:r>
       <w:r>
         <w:rPr>
-          <w:rFonts w:hint="eastAsia" w:ascii="Arial" w:hAnsi="Arial" w:cs="Arial"/>
+          <w:rFonts w:hint="default" w:ascii="Arial" w:hAnsi="Arial" w:cs="Arial"/>
           <w:b w:val="0"/>
           <w:bCs w:val="0"/>
           <w:sz w:val="24"/>
@@ -2642,19 +3788,6 @@
         </w:rPr>
         <w:fldChar w:fldCharType="end"/>
       </w:r>
-    </w:p>
-    <w:p>
-      <w:pPr>
-        <w:jc w:val="left"/>
-        <w:rPr>
-          <w:rFonts w:hint="default" w:ascii="Arial" w:hAnsi="Arial" w:cs="Arial"/>
-          <w:b w:val="0"/>
-          <w:bCs w:val="0"/>
-          <w:sz w:val="24"/>
-          <w:szCs w:val="24"/>
-          <w:lang w:val="en-US" w:eastAsia="zh-CN"/>
-        </w:rPr>
-      </w:pPr>
     </w:p>
     <w:sectPr>
       <w:pgSz w:w="11906" w:h="16838"/>
@@ -2762,8 +3895,8 @@
     <w:lsdException w:unhideWhenUsed="0" w:uiPriority="0" w:semiHidden="0" w:name="Body Text Indent 2"/>
     <w:lsdException w:unhideWhenUsed="0" w:uiPriority="0" w:semiHidden="0" w:name="Body Text Indent 3"/>
     <w:lsdException w:unhideWhenUsed="0" w:uiPriority="0" w:semiHidden="0" w:name="Block Text"/>
-    <w:lsdException w:unhideWhenUsed="0" w:uiPriority="0" w:semiHidden="0" w:name="Hyperlink"/>
-    <w:lsdException w:unhideWhenUsed="0" w:uiPriority="0" w:semiHidden="0" w:name="FollowedHyperlink"/>
+    <w:lsdException w:qFormat="1" w:unhideWhenUsed="0" w:uiPriority="0" w:semiHidden="0" w:name="Hyperlink"/>
+    <w:lsdException w:qFormat="1" w:unhideWhenUsed="0" w:uiPriority="0" w:semiHidden="0" w:name="FollowedHyperlink"/>
     <w:lsdException w:qFormat="1" w:unhideWhenUsed="0" w:uiPriority="0" w:semiHidden="0" w:name="Strong"/>
     <w:lsdException w:qFormat="1" w:unhideWhenUsed="0" w:uiPriority="0" w:semiHidden="0" w:name="Emphasis"/>
     <w:lsdException w:unhideWhenUsed="0" w:uiPriority="0" w:semiHidden="0" w:name="Document Map"/>
@@ -3022,6 +4155,7 @@
   <w:style w:type="character" w:styleId="7">
     <w:name w:val="FollowedHyperlink"/>
     <w:basedOn w:val="6"/>
+    <w:qFormat/>
     <w:uiPriority w:val="0"/>
     <w:rPr>
       <w:color w:val="800080"/>
@@ -3031,6 +4165,7 @@
   <w:style w:type="character" w:styleId="8">
     <w:name w:val="Hyperlink"/>
     <w:basedOn w:val="6"/>
+    <w:qFormat/>
     <w:uiPriority w:val="0"/>
     <w:rPr>
       <w:color w:val="0000FF"/>

</xml_diff>